<commit_message>
style(memo): optimize Word document layout to strict single page format
</commit_message>
<xml_diff>
--- a/memo/memo.docx
+++ b/memo/memo.docx
@@ -4,30 +4,26 @@
   <w:body>
     <w:p>
       <w:pPr>
-        <w:spacing w:before="0" w:after="40"/>
+        <w:spacing w:before="0" w:after="20" w:line="252" w:lineRule="auto"/>
       </w:pPr>
       <w:r>
         <w:rPr>
           <w:rFonts w:ascii="Calibri" w:hAnsi="Calibri"/>
           <w:b/>
-          <w:color w:val="1E1B4B"/>
-          <w:sz w:val="44"/>
+          <w:color w:val="4F46E5"/>
+          <w:sz w:val="15"/>
         </w:rPr>
-        <w:t>MEMORANDUM</w:t>
+        <w:t>FOUNDER'S OFFICE &amp; FINANCE  |  AI FORWARD DEPLOYED INITIATIVE</w:t>
+        <w:br/>
       </w:r>
-    </w:p>
-    <w:p>
-      <w:pPr>
-        <w:spacing w:after="240"/>
-      </w:pPr>
       <w:r>
         <w:rPr>
           <w:rFonts w:ascii="Calibri" w:hAnsi="Calibri"/>
           <w:b/>
-          <w:color w:val="5C3BE8"/>
-          <w:sz w:val="17"/>
+          <w:color w:val="1E1B4B"/>
+          <w:sz w:val="26"/>
         </w:rPr>
-        <w:t>FOUNDER'S OFFICE &amp; FINANCE  |  AI FORWARD DEPLOYED INITIATIVE</w:t>
+        <w:t>EXECUTIVE MEMORANDUM: SIZING &amp; STRATEGY FOR TRIAL ATTENDANCE</w:t>
       </w:r>
     </w:p>
     <w:tbl>
@@ -46,159 +42,71 @@
         </w:tblBorders>
       </w:tblPr>
       <w:tblGrid>
-        <w:gridCol w:w="4968"/>
-        <w:gridCol w:w="4968"/>
+        <w:gridCol w:w="5263"/>
+        <w:gridCol w:w="5263"/>
       </w:tblGrid>
       <w:tr>
         <w:tc>
           <w:tcPr>
-            <w:tcW w:type="dxa" w:w="1584"/>
+            <w:tcW w:type="dxa" w:w="6480"/>
             <w:tcMar>
-              <w:top w:w="40" w:type="dxa"/>
-              <w:bottom w:w="40" w:type="dxa"/>
-              <w:left w:w="60" w:type="dxa"/>
-              <w:right w:w="60" w:type="dxa"/>
+              <w:top w:w="15" w:type="dxa"/>
+              <w:bottom w:w="15" w:type="dxa"/>
+              <w:left w:w="30" w:type="dxa"/>
+              <w:right w:w="30" w:type="dxa"/>
             </w:tcMar>
           </w:tcPr>
           <w:p>
             <w:pPr>
-              <w:spacing w:after="40"/>
+              <w:spacing w:before="0" w:after="0"/>
             </w:pPr>
             <w:r>
               <w:rPr>
                 <w:rFonts w:ascii="Calibri" w:hAnsi="Calibri"/>
                 <w:b/>
                 <w:color w:val="64748B"/>
-                <w:sz w:val="18"/>
+                <w:sz w:val="15"/>
               </w:rPr>
-              <w:t>TO:</w:t>
+              <w:t xml:space="preserve">TO: </w:t>
+            </w:r>
+            <w:r>
+              <w:rPr>
+                <w:rFonts w:ascii="Calibri" w:hAnsi="Calibri"/>
+                <w:color w:val="0F172A"/>
+                <w:sz w:val="15"/>
+              </w:rPr>
+              <w:t>Founder's Office &amp; Finance, BrightCHAMPS</w:t>
             </w:r>
           </w:p>
         </w:tc>
         <w:tc>
           <w:tcPr>
-            <w:tcW w:type="dxa" w:w="8208"/>
+            <w:tcW w:type="dxa" w:w="4032"/>
             <w:tcMar>
-              <w:top w:w="40" w:type="dxa"/>
-              <w:bottom w:w="40" w:type="dxa"/>
-              <w:left w:w="60" w:type="dxa"/>
-              <w:right w:w="60" w:type="dxa"/>
+              <w:top w:w="15" w:type="dxa"/>
+              <w:bottom w:w="15" w:type="dxa"/>
+              <w:left w:w="30" w:type="dxa"/>
+              <w:right w:w="30" w:type="dxa"/>
             </w:tcMar>
           </w:tcPr>
           <w:p>
             <w:pPr>
-              <w:spacing w:after="40"/>
-            </w:pPr>
-            <w:r>
-              <w:rPr>
-                <w:rFonts w:ascii="Calibri" w:hAnsi="Calibri"/>
-                <w:b w:val="0"/>
-                <w:color w:val="0F172A"/>
-                <w:sz w:val="18"/>
-              </w:rPr>
-              <w:t>Founder's Office &amp; Finance, BrightCHAMPS</w:t>
-            </w:r>
-          </w:p>
-        </w:tc>
-      </w:tr>
-      <w:tr>
-        <w:tc>
-          <w:tcPr>
-            <w:tcW w:type="dxa" w:w="1584"/>
-            <w:tcMar>
-              <w:top w:w="40" w:type="dxa"/>
-              <w:bottom w:w="40" w:type="dxa"/>
-              <w:left w:w="60" w:type="dxa"/>
-              <w:right w:w="60" w:type="dxa"/>
-            </w:tcMar>
-          </w:tcPr>
-          <w:p>
-            <w:pPr>
-              <w:spacing w:after="40"/>
+              <w:spacing w:before="0" w:after="0"/>
             </w:pPr>
             <w:r>
               <w:rPr>
                 <w:rFonts w:ascii="Calibri" w:hAnsi="Calibri"/>
                 <w:b/>
                 <w:color w:val="64748B"/>
-                <w:sz w:val="18"/>
+                <w:sz w:val="15"/>
               </w:rPr>
-              <w:t>FROM:</w:t>
+              <w:t xml:space="preserve">DATE: </w:t>
             </w:r>
-          </w:p>
-        </w:tc>
-        <w:tc>
-          <w:tcPr>
-            <w:tcW w:type="dxa" w:w="8208"/>
-            <w:tcMar>
-              <w:top w:w="40" w:type="dxa"/>
-              <w:bottom w:w="40" w:type="dxa"/>
-              <w:left w:w="60" w:type="dxa"/>
-              <w:right w:w="60" w:type="dxa"/>
-            </w:tcMar>
-          </w:tcPr>
-          <w:p>
-            <w:pPr>
-              <w:spacing w:after="40"/>
-            </w:pPr>
             <w:r>
               <w:rPr>
                 <w:rFonts w:ascii="Calibri" w:hAnsi="Calibri"/>
-                <w:b w:val="0"/>
                 <w:color w:val="0F172A"/>
-                <w:sz w:val="18"/>
-              </w:rPr>
-              <w:t>Candidate (AI Forward Deployed Associate)</w:t>
-            </w:r>
-          </w:p>
-        </w:tc>
-      </w:tr>
-      <w:tr>
-        <w:tc>
-          <w:tcPr>
-            <w:tcW w:type="dxa" w:w="1584"/>
-            <w:tcMar>
-              <w:top w:w="40" w:type="dxa"/>
-              <w:bottom w:w="40" w:type="dxa"/>
-              <w:left w:w="60" w:type="dxa"/>
-              <w:right w:w="60" w:type="dxa"/>
-            </w:tcMar>
-          </w:tcPr>
-          <w:p>
-            <w:pPr>
-              <w:spacing w:after="40"/>
-            </w:pPr>
-            <w:r>
-              <w:rPr>
-                <w:rFonts w:ascii="Calibri" w:hAnsi="Calibri"/>
-                <w:b/>
-                <w:color w:val="64748B"/>
-                <w:sz w:val="18"/>
-              </w:rPr>
-              <w:t>DATE:</w:t>
-            </w:r>
-          </w:p>
-        </w:tc>
-        <w:tc>
-          <w:tcPr>
-            <w:tcW w:type="dxa" w:w="8208"/>
-            <w:tcMar>
-              <w:top w:w="40" w:type="dxa"/>
-              <w:bottom w:w="40" w:type="dxa"/>
-              <w:left w:w="60" w:type="dxa"/>
-              <w:right w:w="60" w:type="dxa"/>
-            </w:tcMar>
-          </w:tcPr>
-          <w:p>
-            <w:pPr>
-              <w:spacing w:after="40"/>
-            </w:pPr>
-            <w:r>
-              <w:rPr>
-                <w:rFonts w:ascii="Calibri" w:hAnsi="Calibri"/>
-                <w:b w:val="0"/>
-                <w:color w:val="0F172A"/>
-                <w:sz w:val="18"/>
+                <w:sz w:val="15"/>
               </w:rPr>
               <w:t>September 21, 2026</w:t>
             </w:r>
@@ -208,51 +116,68 @@
       <w:tr>
         <w:tc>
           <w:tcPr>
-            <w:tcW w:type="dxa" w:w="1584"/>
+            <w:tcW w:type="dxa" w:w="6480"/>
             <w:tcMar>
-              <w:top w:w="40" w:type="dxa"/>
-              <w:bottom w:w="40" w:type="dxa"/>
-              <w:left w:w="60" w:type="dxa"/>
-              <w:right w:w="60" w:type="dxa"/>
+              <w:top w:w="15" w:type="dxa"/>
+              <w:bottom w:w="15" w:type="dxa"/>
+              <w:left w:w="30" w:type="dxa"/>
+              <w:right w:w="30" w:type="dxa"/>
             </w:tcMar>
           </w:tcPr>
           <w:p>
             <w:pPr>
-              <w:spacing w:after="40"/>
+              <w:spacing w:before="0" w:after="0"/>
             </w:pPr>
             <w:r>
               <w:rPr>
                 <w:rFonts w:ascii="Calibri" w:hAnsi="Calibri"/>
                 <w:b/>
                 <w:color w:val="64748B"/>
-                <w:sz w:val="18"/>
+                <w:sz w:val="15"/>
               </w:rPr>
-              <w:t>SUBJECT:</w:t>
+              <w:t xml:space="preserve">FROM: </w:t>
+            </w:r>
+            <w:r>
+              <w:rPr>
+                <w:rFonts w:ascii="Calibri" w:hAnsi="Calibri"/>
+                <w:color w:val="0F172A"/>
+                <w:sz w:val="15"/>
+              </w:rPr>
+              <w:t>Candidate (AI Forward Deployed Associate)</w:t>
             </w:r>
           </w:p>
         </w:tc>
         <w:tc>
           <w:tcPr>
-            <w:tcW w:type="dxa" w:w="8208"/>
+            <w:tcW w:type="dxa" w:w="4032"/>
             <w:tcMar>
-              <w:top w:w="40" w:type="dxa"/>
-              <w:bottom w:w="40" w:type="dxa"/>
-              <w:left w:w="60" w:type="dxa"/>
-              <w:right w:w="60" w:type="dxa"/>
+              <w:top w:w="15" w:type="dxa"/>
+              <w:bottom w:w="15" w:type="dxa"/>
+              <w:left w:w="30" w:type="dxa"/>
+              <w:right w:w="30" w:type="dxa"/>
             </w:tcMar>
           </w:tcPr>
           <w:p>
             <w:pPr>
-              <w:spacing w:after="40"/>
+              <w:spacing w:before="0" w:after="0"/>
             </w:pPr>
             <w:r>
               <w:rPr>
                 <w:rFonts w:ascii="Calibri" w:hAnsi="Calibri"/>
                 <w:b/>
+                <w:color w:val="64748B"/>
+                <w:sz w:val="15"/>
+              </w:rPr>
+              <w:t xml:space="preserve">TARGET: </w:t>
+            </w:r>
+            <w:r>
+              <w:rPr>
+                <w:rFonts w:ascii="Calibri" w:hAnsi="Calibri"/>
+                <w:b/>
                 <w:color w:val="0F172A"/>
-                <w:sz w:val="18"/>
+                <w:sz w:val="15"/>
               </w:rPr>
-              <w:t>Economic Sizing &amp; 14-Day Operational Strategy: Slashing Trial No-Show Rates</w:t>
+              <w:t>Pre-Demo Attendance Rate (+₹24.12L/mo)</w:t>
             </w:r>
           </w:p>
         </w:tc>
@@ -260,7 +185,7 @@
     </w:tbl>
     <w:p>
       <w:pPr>
-        <w:spacing w:after="160"/>
+        <w:spacing w:after="40"/>
       </w:pPr>
     </w:p>
     <w:tbl>
@@ -279,78 +204,78 @@
         </w:tblBorders>
       </w:tblPr>
       <w:tblGrid>
-        <w:gridCol w:w="2484"/>
-        <w:gridCol w:w="2484"/>
-        <w:gridCol w:w="2484"/>
-        <w:gridCol w:w="2484"/>
+        <w:gridCol w:w="2632"/>
+        <w:gridCol w:w="2632"/>
+        <w:gridCol w:w="2632"/>
+        <w:gridCol w:w="2632"/>
       </w:tblGrid>
       <w:tr>
         <w:tc>
           <w:tcPr>
-            <w:tcW w:type="dxa" w:w="2448"/>
+            <w:tcW w:type="dxa" w:w="2621"/>
             <w:shd w:fill="FEF2F2"/>
             <w:tcMar>
-              <w:top w:w="120" w:type="dxa"/>
-              <w:bottom w:w="120" w:type="dxa"/>
-              <w:left w:w="100" w:type="dxa"/>
-              <w:right w:w="100" w:type="dxa"/>
+              <w:top w:w="40" w:type="dxa"/>
+              <w:bottom w:w="40" w:type="dxa"/>
+              <w:left w:w="40" w:type="dxa"/>
+              <w:right w:w="40" w:type="dxa"/>
             </w:tcMar>
           </w:tcPr>
           <w:p>
             <w:pPr>
-              <w:spacing w:after="40"/>
+              <w:spacing w:before="0" w:after="0" w:line="240" w:lineRule="auto"/>
             </w:pPr>
             <w:r>
               <w:rPr>
                 <w:rFonts w:ascii="Calibri" w:hAnsi="Calibri"/>
                 <w:b/>
                 <w:color w:val="64748B"/>
-                <w:sz w:val="15"/>
+                <w:sz w:val="13"/>
               </w:rPr>
-              <w:t>GROSS LEAK (CEILING)</w:t>
+              <w:t>GROSS LEAK CEILING</w:t>
               <w:br/>
             </w:r>
             <w:r>
               <w:rPr>
                 <w:rFonts w:ascii="Calibri" w:hAnsi="Calibri"/>
                 <w:b/>
-                <w:color w:val="0F172A"/>
-                <w:sz w:val="24"/>
+                <w:color w:val="B91C1C"/>
+                <w:sz w:val="20"/>
               </w:rPr>
-              <w:t>Rs. 61.62 Lakhs</w:t>
+              <w:t>₹61.62 Lakhs/mo</w:t>
               <w:br/>
             </w:r>
             <w:r>
               <w:rPr>
                 <w:rFonts w:ascii="Calibri" w:hAnsi="Calibri"/>
                 <w:color w:val="334155"/>
-                <w:sz w:val="15"/>
+                <w:sz w:val="13"/>
               </w:rPr>
-              <w:t>584.5 No-Shows / mo</w:t>
+              <w:t>584.5 No-Shows / month</w:t>
             </w:r>
           </w:p>
         </w:tc>
         <w:tc>
           <w:tcPr>
-            <w:tcW w:type="dxa" w:w="2448"/>
+            <w:tcW w:type="dxa" w:w="2621"/>
             <w:shd w:fill="F0FDF4"/>
             <w:tcMar>
-              <w:top w:w="120" w:type="dxa"/>
-              <w:bottom w:w="120" w:type="dxa"/>
-              <w:left w:w="100" w:type="dxa"/>
-              <w:right w:w="100" w:type="dxa"/>
+              <w:top w:w="40" w:type="dxa"/>
+              <w:bottom w:w="40" w:type="dxa"/>
+              <w:left w:w="40" w:type="dxa"/>
+              <w:right w:w="40" w:type="dxa"/>
             </w:tcMar>
           </w:tcPr>
           <w:p>
             <w:pPr>
-              <w:spacing w:after="40"/>
+              <w:spacing w:before="0" w:after="0" w:line="240" w:lineRule="auto"/>
             </w:pPr>
             <w:r>
               <w:rPr>
                 <w:rFonts w:ascii="Calibri" w:hAnsi="Calibri"/>
                 <w:b/>
                 <w:color w:val="64748B"/>
-                <w:sz w:val="15"/>
+                <w:sz w:val="13"/>
               </w:rPr>
               <w:t>RECOVERABLE CASH</w:t>
               <w:br/>
@@ -359,43 +284,43 @@
               <w:rPr>
                 <w:rFonts w:ascii="Calibri" w:hAnsi="Calibri"/>
                 <w:b/>
-                <w:color w:val="0F172A"/>
-                <w:sz w:val="24"/>
+                <w:color w:val="166534"/>
+                <w:sz w:val="20"/>
               </w:rPr>
-              <w:t>+Rs. 24.12 Lakhs</w:t>
+              <w:t>+₹24.12 Lakhs/mo</w:t>
               <w:br/>
             </w:r>
             <w:r>
               <w:rPr>
                 <w:rFonts w:ascii="Calibri" w:hAnsi="Calibri"/>
                 <w:color w:val="334155"/>
-                <w:sz w:val="15"/>
+                <w:sz w:val="13"/>
               </w:rPr>
-              <w:t>Per month (+40.2 conv)</w:t>
+              <w:t>+40.2 Net Conv/mo (68.9x ROI)</w:t>
             </w:r>
           </w:p>
         </w:tc>
         <w:tc>
           <w:tcPr>
-            <w:tcW w:type="dxa" w:w="2448"/>
+            <w:tcW w:type="dxa" w:w="2621"/>
             <w:shd w:fill="F8FAFC"/>
             <w:tcMar>
-              <w:top w:w="120" w:type="dxa"/>
-              <w:bottom w:w="120" w:type="dxa"/>
-              <w:left w:w="100" w:type="dxa"/>
-              <w:right w:w="100" w:type="dxa"/>
+              <w:top w:w="40" w:type="dxa"/>
+              <w:bottom w:w="40" w:type="dxa"/>
+              <w:left w:w="40" w:type="dxa"/>
+              <w:right w:w="40" w:type="dxa"/>
             </w:tcMar>
           </w:tcPr>
           <w:p>
             <w:pPr>
-              <w:spacing w:after="40"/>
+              <w:spacing w:before="0" w:after="0" w:line="240" w:lineRule="auto"/>
             </w:pPr>
             <w:r>
               <w:rPr>
                 <w:rFonts w:ascii="Calibri" w:hAnsi="Calibri"/>
                 <w:b/>
                 <w:color w:val="64748B"/>
-                <w:sz w:val="15"/>
+                <w:sz w:val="13"/>
               </w:rPr>
               <w:t>CONTROL BASELINE</w:t>
               <w:br/>
@@ -404,8 +329,8 @@
               <w:rPr>
                 <w:rFonts w:ascii="Calibri" w:hAnsi="Calibri"/>
                 <w:b/>
-                <w:color w:val="0F172A"/>
-                <w:sz w:val="24"/>
+                <w:color w:val="1E1B4B"/>
+                <w:sz w:val="20"/>
               </w:rPr>
               <w:t>63.80% Show Rate</w:t>
               <w:br/>
@@ -414,33 +339,33 @@
               <w:rPr>
                 <w:rFonts w:ascii="Calibri" w:hAnsi="Calibri"/>
                 <w:color w:val="334155"/>
-                <w:sz w:val="15"/>
+                <w:sz w:val="13"/>
               </w:rPr>
-              <w:t>1,614.5 scheduled/mo</w:t>
+              <w:t>1,614.5 scheduled demos/mo</w:t>
             </w:r>
           </w:p>
         </w:tc>
         <w:tc>
           <w:tcPr>
-            <w:tcW w:type="dxa" w:w="2448"/>
-            <w:shd w:fill="F0EDFF"/>
+            <w:tcW w:type="dxa" w:w="2621"/>
+            <w:shd w:fill="EEF2FF"/>
             <w:tcMar>
-              <w:top w:w="120" w:type="dxa"/>
-              <w:bottom w:w="120" w:type="dxa"/>
-              <w:left w:w="100" w:type="dxa"/>
-              <w:right w:w="100" w:type="dxa"/>
+              <w:top w:w="40" w:type="dxa"/>
+              <w:bottom w:w="40" w:type="dxa"/>
+              <w:left w:w="40" w:type="dxa"/>
+              <w:right w:w="40" w:type="dxa"/>
             </w:tcMar>
           </w:tcPr>
           <w:p>
             <w:pPr>
-              <w:spacing w:after="40"/>
+              <w:spacing w:before="0" w:after="0" w:line="240" w:lineRule="auto"/>
             </w:pPr>
             <w:r>
               <w:rPr>
                 <w:rFonts w:ascii="Calibri" w:hAnsi="Calibri"/>
                 <w:b/>
                 <w:color w:val="64748B"/>
-                <w:sz w:val="15"/>
+                <w:sz w:val="13"/>
               </w:rPr>
               <w:t>TARGET THRESHOLD</w:t>
               <w:br/>
@@ -449,8 +374,8 @@
               <w:rPr>
                 <w:rFonts w:ascii="Calibri" w:hAnsi="Calibri"/>
                 <w:b/>
-                <w:color w:val="0F172A"/>
-                <w:sz w:val="24"/>
+                <w:color w:val="4F46E5"/>
+                <w:sz w:val="20"/>
               </w:rPr>
               <w:t>78.00% Show Rate</w:t>
               <w:br/>
@@ -459,9 +384,9 @@
               <w:rPr>
                 <w:rFonts w:ascii="Calibri" w:hAnsi="Calibri"/>
                 <w:color w:val="334155"/>
-                <w:sz w:val="15"/>
+                <w:sz w:val="13"/>
               </w:rPr>
-              <w:t>Internal 24-48h cohort</w:t>
+              <w:t>Internal 24–48h benchmark cohort</w:t>
             </w:r>
           </w:p>
         </w:tc>
@@ -469,38 +394,46 @@
     </w:tbl>
     <w:p>
       <w:pPr>
-        <w:spacing w:after="200"/>
-      </w:pPr>
-    </w:p>
-    <w:p>
-      <w:pPr>
-        <w:spacing w:before="280" w:after="80"/>
+        <w:spacing w:before="80" w:after="30"/>
       </w:pPr>
       <w:r>
         <w:rPr>
           <w:rFonts w:ascii="Calibri" w:hAnsi="Calibri"/>
           <w:b/>
           <w:color w:val="1E1B4B"/>
-          <w:sz w:val="22"/>
+          <w:sz w:val="17"/>
         </w:rPr>
-        <w:t>1. The Leak: Theoretical Ceiling vs. Realistic Recoverable Loss</w:t>
+        <w:t>1. THE LEAK: THEORETICAL CEILING VS. RECOVERABLE CASH</w:t>
       </w:r>
     </w:p>
     <w:p>
       <w:pPr>
-        <w:spacing w:after="120" w:line="276" w:lineRule="auto"/>
+        <w:spacing w:before="0" w:after="40" w:line="252" w:lineRule="auto"/>
       </w:pPr>
       <w:r>
-        <w:t xml:space="preserve">Across the two-month operating dataset (5,000 leads; 2,500/month) at Rs. 60,000 revenue per customer and Rs. 900 blended CAC, the single largest revenue drain occurs at </w:t>
+        <w:rPr>
+          <w:rFonts w:ascii="Calibri" w:hAnsi="Calibri"/>
+          <w:color w:val="0F172A"/>
+          <w:sz w:val="15"/>
+        </w:rPr>
+        <w:t xml:space="preserve">Across 5,000 anonymised leads covering two operating months (June–July 2026; 2,500/mo) at ₹60,000 revenue per student and ₹900 CAC, the funnel's single largest revenue drain is </w:t>
       </w:r>
       <w:r>
         <w:rPr>
+          <w:rFonts w:ascii="Calibri" w:hAnsi="Calibri"/>
           <w:b/>
+          <w:color w:val="0F172A"/>
+          <w:sz w:val="15"/>
         </w:rPr>
-        <w:t>Demo Scheduled -&gt; Demo Joined (The Pre-Demo No-Show Drop)</w:t>
+        <w:t>Demo Scheduled → Demo Joined (The Pre-Demo No-Show Drop)</w:t>
       </w:r>
       <w:r>
-        <w:t>. Out of 3,229 scheduled demos, 1,169 parents failed to attend (36.20% no-show rate; 584.5 no-shows/month).</w:t>
+        <w:rPr>
+          <w:rFonts w:ascii="Calibri" w:hAnsi="Calibri"/>
+          <w:color w:val="0F172A"/>
+          <w:sz w:val="15"/>
+        </w:rPr>
+        <w:t>. Out of 3,229 scheduled demos, 1,169 failed to attend (584.5 no-shows/mo; 36.20% no-show rate). With a 17.57% historical attendee-to-paid conversion rate (362/2,060), each attending parent has an expected value of ₹10,544. The theoretical maximum ceiling is ₹61,62,786/mo (~₹61.62 Lakhs/mo). Crucially, timestamp analysis uncovers a 24-hour scheduling lag cliff: leads scheduled within 24–48 hours already achieve an internal show rate of 77.52%, whereas leads delayed &gt;48 hours collapse to 45.40%. Our 78.00% target is an internal empirical benchmark, recovering 229.3 attendees/month and eliminating 172 hours/mo of sales counselor downtime in empty Zoom rooms.</w:t>
       </w:r>
     </w:p>
     <w:tbl>
@@ -519,11 +452,11 @@
         </w:tblBorders>
       </w:tblPr>
       <w:tblGrid>
-        <w:gridCol w:w="1987"/>
-        <w:gridCol w:w="1987"/>
-        <w:gridCol w:w="1987"/>
-        <w:gridCol w:w="1987"/>
-        <w:gridCol w:w="1987"/>
+        <w:gridCol w:w="2105"/>
+        <w:gridCol w:w="2105"/>
+        <w:gridCol w:w="2105"/>
+        <w:gridCol w:w="2105"/>
+        <w:gridCol w:w="2105"/>
       </w:tblGrid>
       <w:tr>
         <w:tc>
@@ -531,76 +464,24 @@
             <w:tcW w:type="dxa" w:w="2592"/>
             <w:shd w:fill="F1F5F9"/>
             <w:tcMar>
-              <w:top w:w="80" w:type="dxa"/>
-              <w:bottom w:w="80" w:type="dxa"/>
-              <w:left w:w="80" w:type="dxa"/>
-              <w:right w:w="80" w:type="dxa"/>
+              <w:top w:w="20" w:type="dxa"/>
+              <w:bottom w:w="20" w:type="dxa"/>
+              <w:left w:w="30" w:type="dxa"/>
+              <w:right w:w="30" w:type="dxa"/>
             </w:tcMar>
           </w:tcPr>
           <w:p>
             <w:pPr>
-              <w:spacing w:after="0"/>
+              <w:spacing w:before="0" w:after="0"/>
             </w:pPr>
             <w:r>
               <w:rPr>
                 <w:rFonts w:ascii="Calibri" w:hAnsi="Calibri"/>
                 <w:b/>
                 <w:color w:val="334155"/>
-                <w:sz w:val="17"/>
+                <w:sz w:val="14"/>
               </w:rPr>
               <w:t>Funnel Stage</w:t>
-            </w:r>
-          </w:p>
-        </w:tc>
-        <w:tc>
-          <w:tcPr>
-            <w:tcW w:type="dxa" w:w="1296"/>
-            <w:shd w:fill="F1F5F9"/>
-            <w:tcMar>
-              <w:top w:w="80" w:type="dxa"/>
-              <w:bottom w:w="80" w:type="dxa"/>
-              <w:left w:w="80" w:type="dxa"/>
-              <w:right w:w="80" w:type="dxa"/>
-            </w:tcMar>
-          </w:tcPr>
-          <w:p>
-            <w:pPr>
-              <w:spacing w:after="0"/>
-            </w:pPr>
-            <w:r>
-              <w:rPr>
-                <w:rFonts w:ascii="Calibri" w:hAnsi="Calibri"/>
-                <w:b/>
-                <w:color w:val="334155"/>
-                <w:sz w:val="17"/>
-              </w:rPr>
-              <w:t>Monthly Vol</w:t>
-            </w:r>
-          </w:p>
-        </w:tc>
-        <w:tc>
-          <w:tcPr>
-            <w:tcW w:type="dxa" w:w="1440"/>
-            <w:shd w:fill="F1F5F9"/>
-            <w:tcMar>
-              <w:top w:w="80" w:type="dxa"/>
-              <w:bottom w:w="80" w:type="dxa"/>
-              <w:left w:w="80" w:type="dxa"/>
-              <w:right w:w="80" w:type="dxa"/>
-            </w:tcMar>
-          </w:tcPr>
-          <w:p>
-            <w:pPr>
-              <w:spacing w:after="0"/>
-            </w:pPr>
-            <w:r>
-              <w:rPr>
-                <w:rFonts w:ascii="Calibri" w:hAnsi="Calibri"/>
-                <w:b/>
-                <w:color w:val="334155"/>
-                <w:sz w:val="17"/>
-              </w:rPr>
-              <w:t>Stage Conv %</w:t>
             </w:r>
           </w:p>
         </w:tc>
@@ -609,22 +490,74 @@
             <w:tcW w:type="dxa" w:w="1152"/>
             <w:shd w:fill="F1F5F9"/>
             <w:tcMar>
-              <w:top w:w="80" w:type="dxa"/>
-              <w:bottom w:w="80" w:type="dxa"/>
-              <w:left w:w="80" w:type="dxa"/>
-              <w:right w:w="80" w:type="dxa"/>
+              <w:top w:w="20" w:type="dxa"/>
+              <w:bottom w:w="20" w:type="dxa"/>
+              <w:left w:w="30" w:type="dxa"/>
+              <w:right w:w="30" w:type="dxa"/>
             </w:tcMar>
           </w:tcPr>
           <w:p>
             <w:pPr>
-              <w:spacing w:after="0"/>
+              <w:spacing w:before="0" w:after="0"/>
             </w:pPr>
             <w:r>
               <w:rPr>
                 <w:rFonts w:ascii="Calibri" w:hAnsi="Calibri"/>
                 <w:b/>
                 <w:color w:val="334155"/>
-                <w:sz w:val="17"/>
+                <w:sz w:val="14"/>
+              </w:rPr>
+              <w:t>Monthly Vol</w:t>
+            </w:r>
+          </w:p>
+        </w:tc>
+        <w:tc>
+          <w:tcPr>
+            <w:tcW w:type="dxa" w:w="1224"/>
+            <w:shd w:fill="F1F5F9"/>
+            <w:tcMar>
+              <w:top w:w="20" w:type="dxa"/>
+              <w:bottom w:w="20" w:type="dxa"/>
+              <w:left w:w="30" w:type="dxa"/>
+              <w:right w:w="30" w:type="dxa"/>
+            </w:tcMar>
+          </w:tcPr>
+          <w:p>
+            <w:pPr>
+              <w:spacing w:before="0" w:after="0"/>
+            </w:pPr>
+            <w:r>
+              <w:rPr>
+                <w:rFonts w:ascii="Calibri" w:hAnsi="Calibri"/>
+                <w:b/>
+                <w:color w:val="334155"/>
+                <w:sz w:val="14"/>
+              </w:rPr>
+              <w:t>Stage Conv %</w:t>
+            </w:r>
+          </w:p>
+        </w:tc>
+        <w:tc>
+          <w:tcPr>
+            <w:tcW w:type="dxa" w:w="1008"/>
+            <w:shd w:fill="F1F5F9"/>
+            <w:tcMar>
+              <w:top w:w="20" w:type="dxa"/>
+              <w:bottom w:w="20" w:type="dxa"/>
+              <w:left w:w="30" w:type="dxa"/>
+              <w:right w:w="30" w:type="dxa"/>
+            </w:tcMar>
+          </w:tcPr>
+          <w:p>
+            <w:pPr>
+              <w:spacing w:before="0" w:after="0"/>
+            </w:pPr>
+            <w:r>
+              <w:rPr>
+                <w:rFonts w:ascii="Calibri" w:hAnsi="Calibri"/>
+                <w:b/>
+                <w:color w:val="334155"/>
+                <w:sz w:val="14"/>
               </w:rPr>
               <w:t>Funnel %</w:t>
             </w:r>
@@ -632,27 +565,27 @@
         </w:tc>
         <w:tc>
           <w:tcPr>
-            <w:tcW w:type="dxa" w:w="3312"/>
+            <w:tcW w:type="dxa" w:w="4536"/>
             <w:shd w:fill="F1F5F9"/>
             <w:tcMar>
-              <w:top w:w="80" w:type="dxa"/>
-              <w:bottom w:w="80" w:type="dxa"/>
-              <w:left w:w="80" w:type="dxa"/>
-              <w:right w:w="80" w:type="dxa"/>
+              <w:top w:w="20" w:type="dxa"/>
+              <w:bottom w:w="20" w:type="dxa"/>
+              <w:left w:w="30" w:type="dxa"/>
+              <w:right w:w="30" w:type="dxa"/>
             </w:tcMar>
           </w:tcPr>
           <w:p>
             <w:pPr>
-              <w:spacing w:after="0"/>
+              <w:spacing w:before="0" w:after="0"/>
             </w:pPr>
             <w:r>
               <w:rPr>
                 <w:rFonts w:ascii="Calibri" w:hAnsi="Calibri"/>
                 <w:b/>
                 <w:color w:val="334155"/>
-                <w:sz w:val="17"/>
+                <w:sz w:val="14"/>
               </w:rPr>
-              <w:t>Financial Leak Working (INR / Mo)</w:t>
+              <w:t>Financial Leak Working (INR / Month)</w:t>
             </w:r>
           </w:p>
         </w:tc>
@@ -662,45 +595,45 @@
           <w:tcPr>
             <w:tcW w:type="dxa" w:w="2592"/>
             <w:tcMar>
-              <w:top w:w="60" w:type="dxa"/>
-              <w:bottom w:w="60" w:type="dxa"/>
-              <w:left w:w="80" w:type="dxa"/>
-              <w:right w:w="80" w:type="dxa"/>
+              <w:top w:w="15" w:type="dxa"/>
+              <w:bottom w:w="15" w:type="dxa"/>
+              <w:left w:w="30" w:type="dxa"/>
+              <w:right w:w="30" w:type="dxa"/>
             </w:tcMar>
           </w:tcPr>
           <w:p>
             <w:pPr>
-              <w:spacing w:after="0"/>
+              <w:spacing w:before="0" w:after="0"/>
             </w:pPr>
             <w:r>
               <w:rPr>
                 <w:rFonts w:ascii="Calibri" w:hAnsi="Calibri"/>
                 <w:color w:val="0F172A"/>
-                <w:sz w:val="17"/>
+                <w:sz w:val="14"/>
               </w:rPr>
-              <w:t>Lead -&gt; Demo Scheduled</w:t>
+              <w:t>Lead → Demo Scheduled</w:t>
             </w:r>
           </w:p>
         </w:tc>
         <w:tc>
           <w:tcPr>
-            <w:tcW w:type="dxa" w:w="1296"/>
+            <w:tcW w:type="dxa" w:w="1152"/>
             <w:tcMar>
-              <w:top w:w="60" w:type="dxa"/>
-              <w:bottom w:w="60" w:type="dxa"/>
-              <w:left w:w="80" w:type="dxa"/>
-              <w:right w:w="80" w:type="dxa"/>
+              <w:top w:w="15" w:type="dxa"/>
+              <w:bottom w:w="15" w:type="dxa"/>
+              <w:left w:w="30" w:type="dxa"/>
+              <w:right w:w="30" w:type="dxa"/>
             </w:tcMar>
           </w:tcPr>
           <w:p>
             <w:pPr>
-              <w:spacing w:after="0"/>
+              <w:spacing w:before="0" w:after="0"/>
             </w:pPr>
             <w:r>
               <w:rPr>
                 <w:rFonts w:ascii="Calibri" w:hAnsi="Calibri"/>
                 <w:color w:val="0F172A"/>
-                <w:sz w:val="17"/>
+                <w:sz w:val="14"/>
               </w:rPr>
               <w:t>1,614.5</w:t>
             </w:r>
@@ -708,23 +641,23 @@
         </w:tc>
         <w:tc>
           <w:tcPr>
-            <w:tcW w:type="dxa" w:w="1440"/>
+            <w:tcW w:type="dxa" w:w="1224"/>
             <w:tcMar>
-              <w:top w:w="60" w:type="dxa"/>
-              <w:bottom w:w="60" w:type="dxa"/>
-              <w:left w:w="80" w:type="dxa"/>
-              <w:right w:w="80" w:type="dxa"/>
+              <w:top w:w="15" w:type="dxa"/>
+              <w:bottom w:w="15" w:type="dxa"/>
+              <w:left w:w="30" w:type="dxa"/>
+              <w:right w:w="30" w:type="dxa"/>
             </w:tcMar>
           </w:tcPr>
           <w:p>
             <w:pPr>
-              <w:spacing w:after="0"/>
+              <w:spacing w:before="0" w:after="0"/>
             </w:pPr>
             <w:r>
               <w:rPr>
                 <w:rFonts w:ascii="Calibri" w:hAnsi="Calibri"/>
                 <w:color w:val="0F172A"/>
-                <w:sz w:val="17"/>
+                <w:sz w:val="14"/>
               </w:rPr>
               <w:t>64.58%</w:t>
             </w:r>
@@ -732,23 +665,23 @@
         </w:tc>
         <w:tc>
           <w:tcPr>
-            <w:tcW w:type="dxa" w:w="1152"/>
+            <w:tcW w:type="dxa" w:w="1008"/>
             <w:tcMar>
-              <w:top w:w="60" w:type="dxa"/>
-              <w:bottom w:w="60" w:type="dxa"/>
-              <w:left w:w="80" w:type="dxa"/>
-              <w:right w:w="80" w:type="dxa"/>
+              <w:top w:w="15" w:type="dxa"/>
+              <w:bottom w:w="15" w:type="dxa"/>
+              <w:left w:w="30" w:type="dxa"/>
+              <w:right w:w="30" w:type="dxa"/>
             </w:tcMar>
           </w:tcPr>
           <w:p>
             <w:pPr>
-              <w:spacing w:after="0"/>
+              <w:spacing w:before="0" w:after="0"/>
             </w:pPr>
             <w:r>
               <w:rPr>
                 <w:rFonts w:ascii="Calibri" w:hAnsi="Calibri"/>
                 <w:color w:val="0F172A"/>
-                <w:sz w:val="17"/>
+                <w:sz w:val="14"/>
               </w:rPr>
               <w:t>64.58%</w:t>
             </w:r>
@@ -756,25 +689,25 @@
         </w:tc>
         <w:tc>
           <w:tcPr>
-            <w:tcW w:type="dxa" w:w="3312"/>
+            <w:tcW w:type="dxa" w:w="4536"/>
             <w:tcMar>
-              <w:top w:w="60" w:type="dxa"/>
-              <w:bottom w:w="60" w:type="dxa"/>
-              <w:left w:w="80" w:type="dxa"/>
-              <w:right w:w="80" w:type="dxa"/>
+              <w:top w:w="15" w:type="dxa"/>
+              <w:bottom w:w="15" w:type="dxa"/>
+              <w:left w:w="30" w:type="dxa"/>
+              <w:right w:w="30" w:type="dxa"/>
             </w:tcMar>
           </w:tcPr>
           <w:p>
             <w:pPr>
-              <w:spacing w:after="0"/>
+              <w:spacing w:before="0" w:after="0"/>
             </w:pPr>
             <w:r>
               <w:rPr>
                 <w:rFonts w:ascii="Calibri" w:hAnsi="Calibri"/>
                 <w:color w:val="0F172A"/>
-                <w:sz w:val="17"/>
+                <w:sz w:val="14"/>
               </w:rPr>
-              <w:t>885.5 unscheduled = Rs. 7.97L flushed CAC (Rs. 38.47L lost rev)</w:t>
+              <w:t>885.5 unscheduled = ₹7.97L flushed CAC (₹38.47L lost rev)</w:t>
             </w:r>
           </w:p>
         </w:tc>
@@ -785,76 +718,24 @@
             <w:tcW w:type="dxa" w:w="2592"/>
             <w:shd w:fill="FEF2F2"/>
             <w:tcMar>
-              <w:top w:w="60" w:type="dxa"/>
-              <w:bottom w:w="60" w:type="dxa"/>
-              <w:left w:w="80" w:type="dxa"/>
-              <w:right w:w="80" w:type="dxa"/>
+              <w:top w:w="15" w:type="dxa"/>
+              <w:bottom w:w="15" w:type="dxa"/>
+              <w:left w:w="30" w:type="dxa"/>
+              <w:right w:w="30" w:type="dxa"/>
             </w:tcMar>
           </w:tcPr>
           <w:p>
             <w:pPr>
-              <w:spacing w:after="0"/>
+              <w:spacing w:before="0" w:after="0"/>
             </w:pPr>
             <w:r>
               <w:rPr>
                 <w:rFonts w:ascii="Calibri" w:hAnsi="Calibri"/>
                 <w:b/>
                 <w:color w:val="B91C1C"/>
-                <w:sz w:val="17"/>
+                <w:sz w:val="14"/>
               </w:rPr>
-              <w:t>Demo Scheduled -&gt; Joined</w:t>
-            </w:r>
-          </w:p>
-        </w:tc>
-        <w:tc>
-          <w:tcPr>
-            <w:tcW w:type="dxa" w:w="1296"/>
-            <w:shd w:fill="FEF2F2"/>
-            <w:tcMar>
-              <w:top w:w="60" w:type="dxa"/>
-              <w:bottom w:w="60" w:type="dxa"/>
-              <w:left w:w="80" w:type="dxa"/>
-              <w:right w:w="80" w:type="dxa"/>
-            </w:tcMar>
-          </w:tcPr>
-          <w:p>
-            <w:pPr>
-              <w:spacing w:after="0"/>
-            </w:pPr>
-            <w:r>
-              <w:rPr>
-                <w:rFonts w:ascii="Calibri" w:hAnsi="Calibri"/>
-                <w:b/>
-                <w:color w:val="B91C1C"/>
-                <w:sz w:val="17"/>
-              </w:rPr>
-              <w:t>1,030.0</w:t>
-            </w:r>
-          </w:p>
-        </w:tc>
-        <w:tc>
-          <w:tcPr>
-            <w:tcW w:type="dxa" w:w="1440"/>
-            <w:shd w:fill="FEF2F2"/>
-            <w:tcMar>
-              <w:top w:w="60" w:type="dxa"/>
-              <w:bottom w:w="60" w:type="dxa"/>
-              <w:left w:w="80" w:type="dxa"/>
-              <w:right w:w="80" w:type="dxa"/>
-            </w:tcMar>
-          </w:tcPr>
-          <w:p>
-            <w:pPr>
-              <w:spacing w:after="0"/>
-            </w:pPr>
-            <w:r>
-              <w:rPr>
-                <w:rFonts w:ascii="Calibri" w:hAnsi="Calibri"/>
-                <w:b/>
-                <w:color w:val="B91C1C"/>
-                <w:sz w:val="17"/>
-              </w:rPr>
-              <w:t>63.80%</w:t>
+              <w:t>Demo Scheduled → Joined</w:t>
             </w:r>
           </w:p>
         </w:tc>
@@ -863,22 +744,74 @@
             <w:tcW w:type="dxa" w:w="1152"/>
             <w:shd w:fill="FEF2F2"/>
             <w:tcMar>
-              <w:top w:w="60" w:type="dxa"/>
-              <w:bottom w:w="60" w:type="dxa"/>
-              <w:left w:w="80" w:type="dxa"/>
-              <w:right w:w="80" w:type="dxa"/>
+              <w:top w:w="15" w:type="dxa"/>
+              <w:bottom w:w="15" w:type="dxa"/>
+              <w:left w:w="30" w:type="dxa"/>
+              <w:right w:w="30" w:type="dxa"/>
             </w:tcMar>
           </w:tcPr>
           <w:p>
             <w:pPr>
-              <w:spacing w:after="0"/>
+              <w:spacing w:before="0" w:after="0"/>
             </w:pPr>
             <w:r>
               <w:rPr>
                 <w:rFonts w:ascii="Calibri" w:hAnsi="Calibri"/>
                 <w:b/>
                 <w:color w:val="B91C1C"/>
-                <w:sz w:val="17"/>
+                <w:sz w:val="14"/>
+              </w:rPr>
+              <w:t>1,030.0</w:t>
+            </w:r>
+          </w:p>
+        </w:tc>
+        <w:tc>
+          <w:tcPr>
+            <w:tcW w:type="dxa" w:w="1224"/>
+            <w:shd w:fill="FEF2F2"/>
+            <w:tcMar>
+              <w:top w:w="15" w:type="dxa"/>
+              <w:bottom w:w="15" w:type="dxa"/>
+              <w:left w:w="30" w:type="dxa"/>
+              <w:right w:w="30" w:type="dxa"/>
+            </w:tcMar>
+          </w:tcPr>
+          <w:p>
+            <w:pPr>
+              <w:spacing w:before="0" w:after="0"/>
+            </w:pPr>
+            <w:r>
+              <w:rPr>
+                <w:rFonts w:ascii="Calibri" w:hAnsi="Calibri"/>
+                <w:b/>
+                <w:color w:val="B91C1C"/>
+                <w:sz w:val="14"/>
+              </w:rPr>
+              <w:t>63.80%</w:t>
+            </w:r>
+          </w:p>
+        </w:tc>
+        <w:tc>
+          <w:tcPr>
+            <w:tcW w:type="dxa" w:w="1008"/>
+            <w:shd w:fill="FEF2F2"/>
+            <w:tcMar>
+              <w:top w:w="15" w:type="dxa"/>
+              <w:bottom w:w="15" w:type="dxa"/>
+              <w:left w:w="30" w:type="dxa"/>
+              <w:right w:w="30" w:type="dxa"/>
+            </w:tcMar>
+          </w:tcPr>
+          <w:p>
+            <w:pPr>
+              <w:spacing w:before="0" w:after="0"/>
+            </w:pPr>
+            <w:r>
+              <w:rPr>
+                <w:rFonts w:ascii="Calibri" w:hAnsi="Calibri"/>
+                <w:b/>
+                <w:color w:val="B91C1C"/>
+                <w:sz w:val="14"/>
               </w:rPr>
               <w:t>41.20%</w:t>
             </w:r>
@@ -886,27 +819,27 @@
         </w:tc>
         <w:tc>
           <w:tcPr>
-            <w:tcW w:type="dxa" w:w="3312"/>
+            <w:tcW w:type="dxa" w:w="4536"/>
             <w:shd w:fill="FEF2F2"/>
             <w:tcMar>
-              <w:top w:w="60" w:type="dxa"/>
-              <w:bottom w:w="60" w:type="dxa"/>
-              <w:left w:w="80" w:type="dxa"/>
-              <w:right w:w="80" w:type="dxa"/>
+              <w:top w:w="15" w:type="dxa"/>
+              <w:bottom w:w="15" w:type="dxa"/>
+              <w:left w:w="30" w:type="dxa"/>
+              <w:right w:w="30" w:type="dxa"/>
             </w:tcMar>
           </w:tcPr>
           <w:p>
             <w:pPr>
-              <w:spacing w:after="0"/>
+              <w:spacing w:before="0" w:after="0"/>
             </w:pPr>
             <w:r>
               <w:rPr>
                 <w:rFonts w:ascii="Calibri" w:hAnsi="Calibri"/>
                 <w:b/>
                 <w:color w:val="B91C1C"/>
-                <w:sz w:val="17"/>
+                <w:sz w:val="14"/>
               </w:rPr>
-              <w:t>584.5 NO-SHOWS x 17.57% conv x Rs. 60k = Rs. 61.62L GROSS CEILING</w:t>
+              <w:t>584.5 NO-SHOWS × 17.57% conv × ₹60k = ₹61.62L GROSS CEILING</w:t>
             </w:r>
           </w:p>
         </w:tc>
@@ -916,45 +849,45 @@
           <w:tcPr>
             <w:tcW w:type="dxa" w:w="2592"/>
             <w:tcMar>
-              <w:top w:w="60" w:type="dxa"/>
-              <w:bottom w:w="60" w:type="dxa"/>
-              <w:left w:w="80" w:type="dxa"/>
-              <w:right w:w="80" w:type="dxa"/>
+              <w:top w:w="15" w:type="dxa"/>
+              <w:bottom w:w="15" w:type="dxa"/>
+              <w:left w:w="30" w:type="dxa"/>
+              <w:right w:w="30" w:type="dxa"/>
             </w:tcMar>
           </w:tcPr>
           <w:p>
             <w:pPr>
-              <w:spacing w:after="0"/>
+              <w:spacing w:before="0" w:after="0"/>
             </w:pPr>
             <w:r>
               <w:rPr>
                 <w:rFonts w:ascii="Calibri" w:hAnsi="Calibri"/>
                 <w:color w:val="0F172A"/>
-                <w:sz w:val="17"/>
+                <w:sz w:val="14"/>
               </w:rPr>
-              <w:t>Demo Joined -&gt; Completed</w:t>
+              <w:t>Demo Joined → Completed</w:t>
             </w:r>
           </w:p>
         </w:tc>
         <w:tc>
           <w:tcPr>
-            <w:tcW w:type="dxa" w:w="1296"/>
+            <w:tcW w:type="dxa" w:w="1152"/>
             <w:tcMar>
-              <w:top w:w="60" w:type="dxa"/>
-              <w:bottom w:w="60" w:type="dxa"/>
-              <w:left w:w="80" w:type="dxa"/>
-              <w:right w:w="80" w:type="dxa"/>
+              <w:top w:w="15" w:type="dxa"/>
+              <w:bottom w:w="15" w:type="dxa"/>
+              <w:left w:w="30" w:type="dxa"/>
+              <w:right w:w="30" w:type="dxa"/>
             </w:tcMar>
           </w:tcPr>
           <w:p>
             <w:pPr>
-              <w:spacing w:after="0"/>
+              <w:spacing w:before="0" w:after="0"/>
             </w:pPr>
             <w:r>
               <w:rPr>
                 <w:rFonts w:ascii="Calibri" w:hAnsi="Calibri"/>
                 <w:color w:val="0F172A"/>
-                <w:sz w:val="17"/>
+                <w:sz w:val="14"/>
               </w:rPr>
               <w:t>893.0</w:t>
             </w:r>
@@ -962,23 +895,23 @@
         </w:tc>
         <w:tc>
           <w:tcPr>
-            <w:tcW w:type="dxa" w:w="1440"/>
+            <w:tcW w:type="dxa" w:w="1224"/>
             <w:tcMar>
-              <w:top w:w="60" w:type="dxa"/>
-              <w:bottom w:w="60" w:type="dxa"/>
-              <w:left w:w="80" w:type="dxa"/>
-              <w:right w:w="80" w:type="dxa"/>
+              <w:top w:w="15" w:type="dxa"/>
+              <w:bottom w:w="15" w:type="dxa"/>
+              <w:left w:w="30" w:type="dxa"/>
+              <w:right w:w="30" w:type="dxa"/>
             </w:tcMar>
           </w:tcPr>
           <w:p>
             <w:pPr>
-              <w:spacing w:after="0"/>
+              <w:spacing w:before="0" w:after="0"/>
             </w:pPr>
             <w:r>
               <w:rPr>
                 <w:rFonts w:ascii="Calibri" w:hAnsi="Calibri"/>
                 <w:color w:val="0F172A"/>
-                <w:sz w:val="17"/>
+                <w:sz w:val="14"/>
               </w:rPr>
               <w:t>86.70%</w:t>
             </w:r>
@@ -986,23 +919,23 @@
         </w:tc>
         <w:tc>
           <w:tcPr>
-            <w:tcW w:type="dxa" w:w="1152"/>
+            <w:tcW w:type="dxa" w:w="1008"/>
             <w:tcMar>
-              <w:top w:w="60" w:type="dxa"/>
-              <w:bottom w:w="60" w:type="dxa"/>
-              <w:left w:w="80" w:type="dxa"/>
-              <w:right w:w="80" w:type="dxa"/>
+              <w:top w:w="15" w:type="dxa"/>
+              <w:bottom w:w="15" w:type="dxa"/>
+              <w:left w:w="30" w:type="dxa"/>
+              <w:right w:w="30" w:type="dxa"/>
             </w:tcMar>
           </w:tcPr>
           <w:p>
             <w:pPr>
-              <w:spacing w:after="0"/>
+              <w:spacing w:before="0" w:after="0"/>
             </w:pPr>
             <w:r>
               <w:rPr>
                 <w:rFonts w:ascii="Calibri" w:hAnsi="Calibri"/>
                 <w:color w:val="0F172A"/>
-                <w:sz w:val="17"/>
+                <w:sz w:val="14"/>
               </w:rPr>
               <w:t>35.72%</w:t>
             </w:r>
@@ -1010,25 +943,25 @@
         </w:tc>
         <w:tc>
           <w:tcPr>
-            <w:tcW w:type="dxa" w:w="3312"/>
+            <w:tcW w:type="dxa" w:w="4536"/>
             <w:tcMar>
-              <w:top w:w="60" w:type="dxa"/>
-              <w:bottom w:w="60" w:type="dxa"/>
-              <w:left w:w="80" w:type="dxa"/>
-              <w:right w:w="80" w:type="dxa"/>
+              <w:top w:w="15" w:type="dxa"/>
+              <w:bottom w:w="15" w:type="dxa"/>
+              <w:left w:w="30" w:type="dxa"/>
+              <w:right w:w="30" w:type="dxa"/>
             </w:tcMar>
           </w:tcPr>
           <w:p>
             <w:pPr>
-              <w:spacing w:after="0"/>
+              <w:spacing w:before="0" w:after="0"/>
             </w:pPr>
             <w:r>
               <w:rPr>
                 <w:rFonts w:ascii="Calibri" w:hAnsi="Calibri"/>
                 <w:color w:val="0F172A"/>
-                <w:sz w:val="17"/>
+                <w:sz w:val="14"/>
               </w:rPr>
-              <w:t>137.0 in-demo drops x 20.27% conv x Rs. 60k = Rs. 16.66L / month</w:t>
+              <w:t>137.0 in-demo drops × 20.27% conv × ₹60k = ₹16.66L / month</w:t>
             </w:r>
           </w:p>
         </w:tc>
@@ -1038,45 +971,45 @@
           <w:tcPr>
             <w:tcW w:type="dxa" w:w="2592"/>
             <w:tcMar>
-              <w:top w:w="60" w:type="dxa"/>
-              <w:bottom w:w="60" w:type="dxa"/>
-              <w:left w:w="80" w:type="dxa"/>
-              <w:right w:w="80" w:type="dxa"/>
+              <w:top w:w="15" w:type="dxa"/>
+              <w:bottom w:w="15" w:type="dxa"/>
+              <w:left w:w="30" w:type="dxa"/>
+              <w:right w:w="30" w:type="dxa"/>
             </w:tcMar>
           </w:tcPr>
           <w:p>
             <w:pPr>
-              <w:spacing w:after="0"/>
+              <w:spacing w:before="0" w:after="0"/>
             </w:pPr>
             <w:r>
               <w:rPr>
                 <w:rFonts w:ascii="Calibri" w:hAnsi="Calibri"/>
                 <w:color w:val="0F172A"/>
-                <w:sz w:val="17"/>
+                <w:sz w:val="14"/>
               </w:rPr>
-              <w:t>Demo Completed -&gt; Converted</w:t>
+              <w:t>Demo Completed → Converted</w:t>
             </w:r>
           </w:p>
         </w:tc>
         <w:tc>
           <w:tcPr>
-            <w:tcW w:type="dxa" w:w="1296"/>
+            <w:tcW w:type="dxa" w:w="1152"/>
             <w:tcMar>
-              <w:top w:w="60" w:type="dxa"/>
-              <w:bottom w:w="60" w:type="dxa"/>
-              <w:left w:w="80" w:type="dxa"/>
-              <w:right w:w="80" w:type="dxa"/>
+              <w:top w:w="15" w:type="dxa"/>
+              <w:bottom w:w="15" w:type="dxa"/>
+              <w:left w:w="30" w:type="dxa"/>
+              <w:right w:w="30" w:type="dxa"/>
             </w:tcMar>
           </w:tcPr>
           <w:p>
             <w:pPr>
-              <w:spacing w:after="0"/>
+              <w:spacing w:before="0" w:after="0"/>
             </w:pPr>
             <w:r>
               <w:rPr>
                 <w:rFonts w:ascii="Calibri" w:hAnsi="Calibri"/>
                 <w:color w:val="0F172A"/>
-                <w:sz w:val="17"/>
+                <w:sz w:val="14"/>
               </w:rPr>
               <w:t>181.0</w:t>
             </w:r>
@@ -1084,23 +1017,23 @@
         </w:tc>
         <w:tc>
           <w:tcPr>
-            <w:tcW w:type="dxa" w:w="1440"/>
+            <w:tcW w:type="dxa" w:w="1224"/>
             <w:tcMar>
-              <w:top w:w="60" w:type="dxa"/>
-              <w:bottom w:w="60" w:type="dxa"/>
-              <w:left w:w="80" w:type="dxa"/>
-              <w:right w:w="80" w:type="dxa"/>
+              <w:top w:w="15" w:type="dxa"/>
+              <w:bottom w:w="15" w:type="dxa"/>
+              <w:left w:w="30" w:type="dxa"/>
+              <w:right w:w="30" w:type="dxa"/>
             </w:tcMar>
           </w:tcPr>
           <w:p>
             <w:pPr>
-              <w:spacing w:after="0"/>
+              <w:spacing w:before="0" w:after="0"/>
             </w:pPr>
             <w:r>
               <w:rPr>
                 <w:rFonts w:ascii="Calibri" w:hAnsi="Calibri"/>
                 <w:color w:val="0F172A"/>
-                <w:sz w:val="17"/>
+                <w:sz w:val="14"/>
               </w:rPr>
               <w:t>20.27%</w:t>
             </w:r>
@@ -1108,23 +1041,23 @@
         </w:tc>
         <w:tc>
           <w:tcPr>
-            <w:tcW w:type="dxa" w:w="1152"/>
+            <w:tcW w:type="dxa" w:w="1008"/>
             <w:tcMar>
-              <w:top w:w="60" w:type="dxa"/>
-              <w:bottom w:w="60" w:type="dxa"/>
-              <w:left w:w="80" w:type="dxa"/>
-              <w:right w:w="80" w:type="dxa"/>
+              <w:top w:w="15" w:type="dxa"/>
+              <w:bottom w:w="15" w:type="dxa"/>
+              <w:left w:w="30" w:type="dxa"/>
+              <w:right w:w="30" w:type="dxa"/>
             </w:tcMar>
           </w:tcPr>
           <w:p>
             <w:pPr>
-              <w:spacing w:after="0"/>
+              <w:spacing w:before="0" w:after="0"/>
             </w:pPr>
             <w:r>
               <w:rPr>
                 <w:rFonts w:ascii="Calibri" w:hAnsi="Calibri"/>
                 <w:color w:val="0F172A"/>
-                <w:sz w:val="17"/>
+                <w:sz w:val="14"/>
               </w:rPr>
               <w:t>7.24%</w:t>
             </w:r>
@@ -1132,25 +1065,25 @@
         </w:tc>
         <w:tc>
           <w:tcPr>
-            <w:tcW w:type="dxa" w:w="3312"/>
+            <w:tcW w:type="dxa" w:w="4536"/>
             <w:tcMar>
-              <w:top w:w="60" w:type="dxa"/>
-              <w:bottom w:w="60" w:type="dxa"/>
-              <w:left w:w="80" w:type="dxa"/>
-              <w:right w:w="80" w:type="dxa"/>
+              <w:top w:w="15" w:type="dxa"/>
+              <w:bottom w:w="15" w:type="dxa"/>
+              <w:left w:w="30" w:type="dxa"/>
+              <w:right w:w="30" w:type="dxa"/>
             </w:tcMar>
           </w:tcPr>
           <w:p>
             <w:pPr>
-              <w:spacing w:after="0"/>
+              <w:spacing w:before="0" w:after="0"/>
             </w:pPr>
             <w:r>
               <w:rPr>
                 <w:rFonts w:ascii="Calibri" w:hAnsi="Calibri"/>
                 <w:color w:val="0F172A"/>
-                <w:sz w:val="17"/>
+                <w:sz w:val="14"/>
               </w:rPr>
-              <w:t>Current Revenue: Rs. 1.086 Cr / mo (Contribution: Rs. 86.10L / mo)</w:t>
+              <w:t>Baseline Rev: ₹1.086 Cr / mo (Contribution: ₹86.10L / mo)</w:t>
             </w:r>
           </w:p>
         </w:tc>
@@ -1158,447 +1091,187 @@
     </w:tbl>
     <w:p>
       <w:pPr>
-        <w:spacing w:before="120" w:after="120" w:line="276" w:lineRule="auto"/>
-      </w:pPr>
-      <w:r>
-        <w:rPr>
-          <w:b/>
-        </w:rPr>
-        <w:t xml:space="preserve">Root Cause &amp; Empirical Grounding: </w:t>
-      </w:r>
-      <w:r>
-        <w:t>Sizing requires separating the theoretical ceiling (Rs. 61.62L/month if 100% of no-shows attended) from recoverable revenue. Timestamp analysis uncovers a 24-hour scheduling lag cliff: leads scheduled within 24-48 hours already achieve an internal show rate of 77.52%. When scheduling lag extends beyond 48 hours, parent excitement decays and show rate collapses to 45.4%. Our 78.0% target is therefore an internal empirical benchmark, not an arbitrary guess. Closing this lag gap recovers 229.3 attendees/month and eliminates ~172 wasted sales counselor hours in empty Zoom rooms.</w:t>
-      </w:r>
-    </w:p>
-    <w:p>
-      <w:pPr>
-        <w:spacing w:before="280" w:after="80"/>
+        <w:spacing w:before="80" w:after="30"/>
       </w:pPr>
       <w:r>
         <w:rPr>
           <w:rFonts w:ascii="Calibri" w:hAnsi="Calibri"/>
           <w:b/>
           <w:color w:val="1E1B4B"/>
-          <w:sz w:val="22"/>
+          <w:sz w:val="17"/>
         </w:rPr>
-        <w:t>2. The Lever: AI WhatsApp Attendance Concierge ('Totto') &amp; Trade-Offs</w:t>
+        <w:t>2. THE LEVER: AI WHATSAPP ATTENDANCE CONCIERGE ('TOTTO') &amp; TRADE-OFFS</w:t>
       </w:r>
     </w:p>
     <w:p>
       <w:pPr>
-        <w:spacing w:after="80" w:line="276" w:lineRule="auto"/>
+        <w:spacing w:before="0" w:after="40" w:line="252" w:lineRule="auto"/>
       </w:pPr>
       <w:r>
         <w:rPr>
+          <w:rFonts w:ascii="Calibri" w:hAnsi="Calibri"/>
           <w:b/>
+          <w:color w:val="4F46E5"/>
+          <w:sz w:val="15"/>
         </w:rPr>
-        <w:t xml:space="preserve">The Chosen Lever: </w:t>
+        <w:t xml:space="preserve">• Chosen Zero-Engineering Lever ('Totto'): </w:t>
       </w:r>
       <w:r>
-        <w:t xml:space="preserve">A two-way conversational WhatsApp agent triggered instantly upon demo booking via CRM webhook (Wati/Aisensy + Make.com). The agent executes three automated touchpoints: </w:t>
+        <w:rPr>
+          <w:rFonts w:ascii="Calibri" w:hAnsi="Calibri"/>
+          <w:color w:val="0F172A"/>
+          <w:sz w:val="15"/>
+        </w:rPr>
+        <w:t>A 2-way conversational WhatsApp agent triggered instantly via CRM webhook upon booking (Wati/Aisensy + Make.com). Deployed in 14 days without an engineering sprint: (1) 1-Click Calendar Sync: Injects Google/Apple (.ics) holds + 30s personalized video teaser of the child's coding project. (2) Interactive T-24h &amp; T-2h Confirmation: 1-tap WhatsApp buttons ('Confirm Spot' or 'Reschedule to Tomorrow') to capture schedule conflicts before counselor downtime. (3) T-10m Direct Launch: Pings parent with 1-tap direct Zoom join link and hardware checklist (laptop/audio). Sized Impact: Brings show rate from 63.8% to 78.0% (anchored to 77.5% benchmark), recovering 229.3 attendees/mo = +40.2 net conversions/mo = ₹24,12,000/mo incremental revenue (₹2.89 Cr/yr run-rate) against ₹35k/mo tooling cost (68.9x ROI).</w:t>
+        <w:br/>
+      </w:r>
+      <w:r>
+        <w:rPr>
+          <w:rFonts w:ascii="Calibri" w:hAnsi="Calibri"/>
+          <w:b/>
+          <w:color w:val="334155"/>
+          <w:sz w:val="15"/>
+        </w:rPr>
+        <w:t xml:space="preserve">• Alternatives Considered &amp; Rejected: </w:t>
+      </w:r>
+      <w:r>
+        <w:rPr>
+          <w:rFonts w:ascii="Calibri" w:hAnsi="Calibri"/>
+          <w:color w:val="0F172A"/>
+          <w:sz w:val="15"/>
+        </w:rPr>
+        <w:t>(1) Outbound AI Voice Bot: Rejected due to &gt;60% parent hangups on robocalls and severe TCPA/DND regulatory compliance penalties in US/UK. (2) Timezone Routing Alone: Two-proportion z-tests prove only USA routing is statistically significant (z = 2.65, p = 0.008, unlocking ₹11.31L/mo); other cells are sample noise. Even on US_SHIFT, US no-show is 30.4%. Deployed as Day-1 operational prerequisite. (3) Post-Demo Pitch Copilot: Requires &gt;6 weeks rep coaching, suffers subjective adoption, and ignores empty Zoom rooms.</w:t>
       </w:r>
     </w:p>
     <w:p>
       <w:pPr>
-        <w:pStyle w:val="ListBullet"/>
-        <w:spacing w:after="60" w:line="276" w:lineRule="auto"/>
+        <w:spacing w:before="80" w:after="30"/>
       </w:pPr>
       <w:r>
         <w:rPr>
           <w:rFonts w:ascii="Calibri" w:hAnsi="Calibri"/>
           <w:b/>
           <w:color w:val="1E1B4B"/>
-          <w:sz w:val="19"/>
+          <w:sz w:val="17"/>
         </w:rPr>
-        <w:t xml:space="preserve">Instant 1-Click Calendar Hold: </w:t>
+        <w:t>3. BIGGEST ADOPTION RISK &amp; OPERATIONAL MITIGATION</w:t>
+      </w:r>
+    </w:p>
+    <w:p>
+      <w:pPr>
+        <w:spacing w:before="0" w:after="40" w:line="252" w:lineRule="auto"/>
+      </w:pPr>
+      <w:r>
+        <w:rPr>
+          <w:rFonts w:ascii="Calibri" w:hAnsi="Calibri"/>
+          <w:b/>
+          <w:color w:val="B91C1C"/>
+          <w:sz w:val="15"/>
+        </w:rPr>
+        <w:t xml:space="preserve">• Core Risk (Workflow Bypass &amp; Spam Fatigue): </w:t>
       </w:r>
       <w:r>
         <w:rPr>
           <w:rFonts w:ascii="Calibri" w:hAnsi="Calibri"/>
           <w:color w:val="0F172A"/>
-          <w:sz w:val="19"/>
+          <w:sz w:val="15"/>
         </w:rPr>
-        <w:t>Automatically injects Google/Apple Calendar links (.ics) with reminder alerts and a 30-second video teaser of the child's coding project.</w:t>
+        <w:t>Sales reps may distrust bot confirmations and double-call parents (causing annoyance), while parents may block spammy alerts.</w:t>
+        <w:br/>
+      </w:r>
+      <w:r>
+        <w:rPr>
+          <w:rFonts w:ascii="Calibri" w:hAnsi="Calibri"/>
+          <w:b/>
+          <w:color w:val="4F46E5"/>
+          <w:sz w:val="15"/>
+        </w:rPr>
+        <w:t xml:space="preserve">• Operational Mitigations: </w:t>
+      </w:r>
+      <w:r>
+        <w:rPr>
+          <w:rFonts w:ascii="Calibri" w:hAnsi="Calibri"/>
+          <w:color w:val="0F172A"/>
+          <w:sz w:val="15"/>
+        </w:rPr>
+        <w:t>(1) Zero Disruption SOP: Bot writes directly to CRM field attendance_status ('CONFIRMED', 'RESCHEDULE_PENDING'). Morning standup rule: 'Green means locked; do not dial.' Saves 172 hours/mo. (2) Value-First Engagement: Messages focus on the child's customized project preview rather than sales pressure. (3) Frictionless Opt-Out: Typing 'STOP' halts automation immediately, flagging CRM record DO_NOT_CONTACT.</w:t>
       </w:r>
     </w:p>
     <w:p>
       <w:pPr>
-        <w:pStyle w:val="ListBullet"/>
-        <w:spacing w:after="60" w:line="276" w:lineRule="auto"/>
+        <w:spacing w:before="80" w:after="30"/>
       </w:pPr>
       <w:r>
         <w:rPr>
           <w:rFonts w:ascii="Calibri" w:hAnsi="Calibri"/>
           <w:b/>
           <w:color w:val="1E1B4B"/>
-          <w:sz w:val="19"/>
+          <w:sz w:val="17"/>
         </w:rPr>
-        <w:t xml:space="preserve">Interactive T-24h &amp; T-2h Confirmation: </w:t>
-      </w:r>
-      <w:r>
-        <w:rPr>
-          <w:rFonts w:ascii="Calibri" w:hAnsi="Calibri"/>
-          <w:color w:val="0F172A"/>
-          <w:sz w:val="19"/>
-        </w:rPr>
-        <w:t>Interactive 1-tap WhatsApp buttons ('Confirm Spot' or 'Reschedule to Tomorrow') to capture schedule conflicts ahead of time.</w:t>
+        <w:t>4. PRE-REGISTERED BASELINE &amp; MEASUREMENT FRAMEWORK</w:t>
       </w:r>
     </w:p>
     <w:p>
       <w:pPr>
-        <w:pStyle w:val="ListBullet"/>
-        <w:spacing w:after="60" w:line="276" w:lineRule="auto"/>
+        <w:spacing w:before="0" w:after="0" w:line="252" w:lineRule="auto"/>
       </w:pPr>
       <w:r>
         <w:rPr>
           <w:rFonts w:ascii="Calibri" w:hAnsi="Calibri"/>
           <w:b/>
           <w:color w:val="1E1B4B"/>
-          <w:sz w:val="19"/>
+          <w:sz w:val="15"/>
         </w:rPr>
-        <w:t xml:space="preserve">T-10m Direct Zoom Launch: </w:t>
+        <w:t xml:space="preserve">• Control Baseline &amp; A/B Setup: </w:t>
       </w:r>
       <w:r>
         <w:rPr>
           <w:rFonts w:ascii="Calibri" w:hAnsi="Calibri"/>
           <w:color w:val="0F172A"/>
-          <w:sz w:val="19"/>
+          <w:sz w:val="15"/>
         </w:rPr>
-        <w:t>Pings parents with a direct Zoom join link and a 60-second hardware readiness checklist (laptop audio/Chrome browser).</w:t>
+        <w:t>Scheduled leads = 1,614.5/mo; Baseline Show Rate = 63.80%; Demo-to-Paid = 17.57%; Blended CAC = ₹900. Measured via 14-day 50/50 randomized A/B test split by Lead ID modulo across all geographies.</w:t>
+        <w:br/>
       </w:r>
-    </w:p>
-    <w:p>
-      <w:pPr>
-        <w:pStyle w:val="ListBullet"/>
-        <w:spacing w:after="60" w:line="276" w:lineRule="auto"/>
-      </w:pPr>
       <w:r>
         <w:rPr>
           <w:rFonts w:ascii="Calibri" w:hAnsi="Calibri"/>
           <w:b/>
-          <w:color w:val="1E1B4B"/>
-          <w:sz w:val="19"/>
+          <w:color w:val="4F46E5"/>
+          <w:sz w:val="15"/>
         </w:rPr>
-        <w:t xml:space="preserve">Recoverable Financial Impact: </w:t>
+        <w:t xml:space="preserve">• Target Threshold &amp; Guardrails: </w:t>
       </w:r>
       <w:r>
         <w:rPr>
           <w:rFonts w:ascii="Calibri" w:hAnsi="Calibri"/>
           <w:color w:val="0F172A"/>
-          <w:sz w:val="19"/>
+          <w:sz w:val="15"/>
         </w:rPr>
-        <w:t>Brings show rate from 63.8% to 78.0% (anchored to the 77.5% benchmark). At historical 17.57% demo-to-paid conversion, yields +40.2 net conversions/month = Rs. 24,12,000/month incremental revenue (Rs. 2.89 Cr/year run-rate) against Rs. 35,000/month tooling cost (68.9x ROI).</w:t>
+        <w:t>Primary Success: Variant Show Rate reaches ≥ 78.00% (anchored to 77.52% internal benchmark; p &lt; 0.01). Guardrail: Opt-out rate &lt; 2.5%; Demo completion rate ≥ 86.0%.</w:t>
+        <w:br/>
       </w:r>
-    </w:p>
-    <w:p>
-      <w:pPr>
-        <w:spacing w:before="80" w:after="40"/>
-      </w:pPr>
-      <w:r>
-        <w:rPr>
-          <w:b/>
-        </w:rPr>
-        <w:t>Alternatives Considered and Rejected:</w:t>
-      </w:r>
-    </w:p>
-    <w:p>
-      <w:pPr>
-        <w:pStyle w:val="ListBullet"/>
-        <w:spacing w:after="60" w:line="276" w:lineRule="auto"/>
-      </w:pPr>
       <w:r>
         <w:rPr>
           <w:rFonts w:ascii="Calibri" w:hAnsi="Calibri"/>
           <w:b/>
-          <w:color w:val="334155"/>
-          <w:sz w:val="18"/>
+          <w:color w:val="166534"/>
+          <w:sz w:val="15"/>
         </w:rPr>
-        <w:t xml:space="preserve">Rejected 1: Outbound AI Voice Calling Bot: </w:t>
+        <w:t xml:space="preserve">• Finance Sign-Off Formula: </w:t>
       </w:r>
       <w:r>
         <w:rPr>
           <w:rFonts w:ascii="Calibri" w:hAnsi="Calibri"/>
           <w:color w:val="0F172A"/>
-          <w:sz w:val="18"/>
+          <w:sz w:val="15"/>
         </w:rPr>
-        <w:t>High consumer friction; &gt;60% of parents hang up on robocalls; severe regulatory TCPA and DND compliance penalties in US and UK.</w:t>
-      </w:r>
-    </w:p>
-    <w:p>
-      <w:pPr>
-        <w:pStyle w:val="ListBullet"/>
-        <w:spacing w:after="60" w:line="276" w:lineRule="auto"/>
-      </w:pPr>
-      <w:r>
-        <w:rPr>
-          <w:rFonts w:ascii="Calibri" w:hAnsi="Calibri"/>
-          <w:b/>
-          <w:color w:val="334155"/>
-          <w:sz w:val="18"/>
-        </w:rPr>
-        <w:t xml:space="preserve">Rejected 2: Timezone Routing Alone: </w:t>
-      </w:r>
-      <w:r>
-        <w:rPr>
-          <w:rFonts w:ascii="Calibri" w:hAnsi="Calibri"/>
-          <w:color w:val="0F172A"/>
-          <w:sz w:val="18"/>
-        </w:rPr>
-        <w:t>Two-proportion z-tests show only the USA shift routing is statistically significant (z = 2.65, p = 0.008, unlocking Rs. 11.31L/mo); other cells are sample noise. Even on US_SHIFT, the US no-show rate remains 30.4%. We deploy the USA routing rule on Day 1 as an operational prerequisite, but focus the primary build on attendance.</w:t>
-      </w:r>
-    </w:p>
-    <w:p>
-      <w:pPr>
-        <w:pStyle w:val="ListBullet"/>
-        <w:spacing w:after="60" w:line="276" w:lineRule="auto"/>
-      </w:pPr>
-      <w:r>
-        <w:rPr>
-          <w:rFonts w:ascii="Calibri" w:hAnsi="Calibri"/>
-          <w:b/>
-          <w:color w:val="334155"/>
-          <w:sz w:val="18"/>
-        </w:rPr>
-        <w:t xml:space="preserve">Rejected 3: Post-Demo Pitch AI Copilot: </w:t>
-      </w:r>
-      <w:r>
-        <w:rPr>
-          <w:rFonts w:ascii="Calibri" w:hAnsi="Calibri"/>
-          <w:color w:val="0F172A"/>
-          <w:sz w:val="18"/>
-        </w:rPr>
-        <w:t>Requires &gt;6 weeks of sales rep coaching, suffers from subjective adoption, and does not solve the empty Zoom room problem.</w:t>
-      </w:r>
-    </w:p>
-    <w:p>
-      <w:pPr>
-        <w:spacing w:before="280" w:after="80"/>
-      </w:pPr>
-      <w:r>
-        <w:rPr>
-          <w:rFonts w:ascii="Calibri" w:hAnsi="Calibri"/>
-          <w:b/>
-          <w:color w:val="1E1B4B"/>
-          <w:sz w:val="22"/>
-        </w:rPr>
-        <w:t>3. Biggest Adoption Risk &amp; Operational Mitigation</w:t>
-      </w:r>
-    </w:p>
-    <w:p>
-      <w:pPr>
-        <w:spacing w:after="80" w:line="276" w:lineRule="auto"/>
-      </w:pPr>
-      <w:r>
-        <w:rPr>
-          <w:b/>
-        </w:rPr>
-        <w:t xml:space="preserve">Core Operational Risk: </w:t>
-      </w:r>
-      <w:r>
-        <w:t>Sales rep workflow bypass (counselors double-calling confirmed parents, causing confusion) and parent spam fatigue.</w:t>
-      </w:r>
-    </w:p>
-    <w:p>
-      <w:pPr>
-        <w:pStyle w:val="ListBullet"/>
-        <w:spacing w:after="60" w:line="276" w:lineRule="auto"/>
-      </w:pPr>
-      <w:r>
-        <w:rPr>
-          <w:rFonts w:ascii="Calibri" w:hAnsi="Calibri"/>
-          <w:b/>
-          <w:color w:val="1E1B4B"/>
-          <w:sz w:val="18"/>
-        </w:rPr>
-        <w:t xml:space="preserve">Zero Rep Disruption: </w:t>
-      </w:r>
-      <w:r>
-        <w:rPr>
-          <w:rFonts w:ascii="Calibri" w:hAnsi="Calibri"/>
-          <w:color w:val="0F172A"/>
-          <w:sz w:val="18"/>
-        </w:rPr>
-        <w:t>The bot writes directly to CRM field attendance_status ('CONFIRMED', 'RESCHEDULE_PENDING'). Rep morning standup rule: 'Green means locked; do not dial.' Counselors save 172 hours/month.</w:t>
-      </w:r>
-    </w:p>
-    <w:p>
-      <w:pPr>
-        <w:pStyle w:val="ListBullet"/>
-        <w:spacing w:after="60" w:line="276" w:lineRule="auto"/>
-      </w:pPr>
-      <w:r>
-        <w:rPr>
-          <w:rFonts w:ascii="Calibri" w:hAnsi="Calibri"/>
-          <w:b/>
-          <w:color w:val="1E1B4B"/>
-          <w:sz w:val="18"/>
-        </w:rPr>
-        <w:t xml:space="preserve">Value-First Content: </w:t>
-      </w:r>
-      <w:r>
-        <w:rPr>
-          <w:rFonts w:ascii="Calibri" w:hAnsi="Calibri"/>
-          <w:color w:val="0F172A"/>
-          <w:sz w:val="18"/>
-        </w:rPr>
-        <w:t>Messages are educational and personalized with the child's customized project teaser, not generic reminders.</w:t>
-      </w:r>
-    </w:p>
-    <w:p>
-      <w:pPr>
-        <w:pStyle w:val="ListBullet"/>
-        <w:spacing w:after="60" w:line="276" w:lineRule="auto"/>
-      </w:pPr>
-      <w:r>
-        <w:rPr>
-          <w:rFonts w:ascii="Calibri" w:hAnsi="Calibri"/>
-          <w:b/>
-          <w:color w:val="1E1B4B"/>
-          <w:sz w:val="18"/>
-        </w:rPr>
-        <w:t xml:space="preserve">Instant Opt-Out: </w:t>
-      </w:r>
-      <w:r>
-        <w:rPr>
-          <w:rFonts w:ascii="Calibri" w:hAnsi="Calibri"/>
-          <w:color w:val="0F172A"/>
-          <w:sz w:val="18"/>
-        </w:rPr>
-        <w:t>Replying 'STOP' triggers immediate unsubscribing, tags the CRM record DO_NOT_CONTACT, and halts all automation.</w:t>
-      </w:r>
-    </w:p>
-    <w:p>
-      <w:pPr>
-        <w:spacing w:before="280" w:after="80"/>
-      </w:pPr>
-      <w:r>
-        <w:rPr>
-          <w:rFonts w:ascii="Calibri" w:hAnsi="Calibri"/>
-          <w:b/>
-          <w:color w:val="1E1B4B"/>
-          <w:sz w:val="22"/>
-        </w:rPr>
-        <w:t>4. Measurement Framework &amp; Pre-Registered Baseline</w:t>
-      </w:r>
-    </w:p>
-    <w:p>
-      <w:pPr>
-        <w:pStyle w:val="ListBullet"/>
-        <w:spacing w:after="60" w:line="276" w:lineRule="auto"/>
-      </w:pPr>
-      <w:r>
-        <w:rPr>
-          <w:rFonts w:ascii="Calibri" w:hAnsi="Calibri"/>
-          <w:b/>
-          <w:color w:val="1E1B4B"/>
-          <w:sz w:val="18"/>
-        </w:rPr>
-        <w:t xml:space="preserve">Pre-Registered Control Baseline: </w:t>
-      </w:r>
-      <w:r>
-        <w:rPr>
-          <w:rFonts w:ascii="Calibri" w:hAnsi="Calibri"/>
-          <w:color w:val="0F172A"/>
-          <w:sz w:val="18"/>
-        </w:rPr>
-        <w:t>Demos Scheduled = 1,614.5/mo; Demo Show Rate = 63.80%; Demo Join-to-Paid = 17.57%; Blended CAC = Rs. 900.</w:t>
-      </w:r>
-    </w:p>
-    <w:p>
-      <w:pPr>
-        <w:pStyle w:val="ListBullet"/>
-        <w:spacing w:after="60" w:line="276" w:lineRule="auto"/>
-      </w:pPr>
-      <w:r>
-        <w:rPr>
-          <w:rFonts w:ascii="Calibri" w:hAnsi="Calibri"/>
-          <w:b/>
-          <w:color w:val="1E1B4B"/>
-          <w:sz w:val="18"/>
-        </w:rPr>
-        <w:t xml:space="preserve">Measurement Methodology: </w:t>
-      </w:r>
-      <w:r>
-        <w:rPr>
-          <w:rFonts w:ascii="Calibri" w:hAnsi="Calibri"/>
-          <w:color w:val="0F172A"/>
-          <w:sz w:val="18"/>
-        </w:rPr>
-        <w:t>14-day 50/50 randomized A/B test on all scheduled demos split by Lead ID modulo.</w:t>
-      </w:r>
-    </w:p>
-    <w:p>
-      <w:pPr>
-        <w:pStyle w:val="ListBullet"/>
-        <w:spacing w:after="60" w:line="276" w:lineRule="auto"/>
-      </w:pPr>
-      <w:r>
-        <w:rPr>
-          <w:rFonts w:ascii="Calibri" w:hAnsi="Calibri"/>
-          <w:b/>
-          <w:color w:val="1E1B4B"/>
-          <w:sz w:val="18"/>
-        </w:rPr>
-        <w:t xml:space="preserve">Primary Success Metric: </w:t>
-      </w:r>
-      <w:r>
-        <w:rPr>
-          <w:rFonts w:ascii="Calibri" w:hAnsi="Calibri"/>
-          <w:color w:val="0F172A"/>
-          <w:sz w:val="18"/>
-        </w:rPr>
-        <w:t>Demo Show Rate in Variant reaches &gt;= 78.00% (anchored to the internal 24-48h benchmark of 77.52%; p &lt; 0.01).</w:t>
-      </w:r>
-    </w:p>
-    <w:p>
-      <w:pPr>
-        <w:pStyle w:val="ListBullet"/>
-        <w:spacing w:after="60" w:line="276" w:lineRule="auto"/>
-      </w:pPr>
-      <w:r>
-        <w:rPr>
-          <w:rFonts w:ascii="Calibri" w:hAnsi="Calibri"/>
-          <w:b/>
-          <w:color w:val="1E1B4B"/>
-          <w:sz w:val="18"/>
-        </w:rPr>
-        <w:t xml:space="preserve">Guardrail Metrics: </w:t>
-      </w:r>
-      <w:r>
-        <w:rPr>
-          <w:rFonts w:ascii="Calibri" w:hAnsi="Calibri"/>
-          <w:color w:val="0F172A"/>
-          <w:sz w:val="18"/>
-        </w:rPr>
-        <w:t>Parent WhatsApp opt-out rate &lt; 2.5%; Demo completion rate post-join holds at &gt;= 86.0%.</w:t>
-      </w:r>
-    </w:p>
-    <w:p>
-      <w:pPr>
-        <w:pStyle w:val="ListBullet"/>
-        <w:spacing w:after="60" w:line="276" w:lineRule="auto"/>
-      </w:pPr>
-      <w:r>
-        <w:rPr>
-          <w:rFonts w:ascii="Calibri" w:hAnsi="Calibri"/>
-          <w:b/>
-          <w:color w:val="1E1B4B"/>
-          <w:sz w:val="18"/>
-        </w:rPr>
-        <w:t xml:space="preserve">Finance Sign-Off Formula: </w:t>
-      </w:r>
-      <w:r>
-        <w:rPr>
-          <w:rFonts w:ascii="Calibri" w:hAnsi="Calibri"/>
-          <w:color w:val="0F172A"/>
-          <w:sz w:val="18"/>
-        </w:rPr>
-        <w:t>ΔRevenue = N_scheduled x (ShowRate_Variant - ShowRate_Control) x 17.57% x Rs. 60,000 (Audited weekly by FP&amp;A).</w:t>
+        <w:t>ΔRevenue = N_scheduled × (ShowRate_Variant - ShowRate_Control) × 17.57% × ₹60,000 (Weekly reconciliation with FP&amp;A and Sales Ops).</w:t>
       </w:r>
     </w:p>
     <w:sectPr>
-      <w:pgSz w:w="12240" w:h="15840"/>
-      <w:pgMar w:top="1080" w:right="1152" w:bottom="1080" w:left="1152" w:header="720" w:footer="720" w:gutter="0"/>
+      <w:pgSz w:w="11909" w:h="16834"/>
+      <w:pgMar w:top="504" w:right="691" w:bottom="461" w:left="691" w:header="720" w:footer="720" w:gutter="0"/>
       <w:cols w:space="720"/>
       <w:docGrid w:linePitch="360"/>
     </w:sectPr>

</xml_diff>

<commit_message>
docs: update README with live links and sync 1-page executive memo
</commit_message>
<xml_diff>
--- a/memo/memo.docx
+++ b/memo/memo.docx
@@ -4,7 +4,7 @@
   <w:body>
     <w:p>
       <w:pPr>
-        <w:spacing w:before="0" w:after="20" w:line="252" w:lineRule="auto"/>
+        <w:spacing w:before="0" w:after="40" w:line="240" w:lineRule="auto"/>
       </w:pPr>
       <w:r>
         <w:rPr>
@@ -13,7 +13,7 @@
           <w:color w:val="4F46E5"/>
           <w:sz w:val="15"/>
         </w:rPr>
-        <w:t>FOUNDER'S OFFICE &amp; FINANCE  |  AI FORWARD DEPLOYED INITIATIVE</w:t>
+        <w:t>BRIGHTCHAMPS  |  FOUNDER'S OFFICE &amp; FINANCE  |  AI FORWARD DEPLOYED INITIATIVE</w:t>
         <w:br/>
       </w:r>
       <w:r>
@@ -23,7 +23,7 @@
           <w:color w:val="1E1B4B"/>
           <w:sz w:val="26"/>
         </w:rPr>
-        <w:t>EXECUTIVE MEMORANDUM: SIZING &amp; STRATEGY FOR TRIAL ATTENDANCE</w:t>
+        <w:t>EXECUTIVE MEMORANDUM</w:t>
       </w:r>
     </w:p>
     <w:tbl>
@@ -33,32 +33,32 @@
         <w:tblLayout w:type="fixed"/>
         <w:tblLook w:firstColumn="1" w:firstRow="1" w:lastColumn="0" w:lastRow="0" w:noHBand="0" w:noVBand="1" w:val="04A0"/>
         <w:tblBorders>
-          <w:top w:val="single" w:sz="4" w:space="0" w:color="E2E8F0"/>
-          <w:bottom w:val="single" w:sz="4" w:space="0" w:color="E2E8F0"/>
-          <w:insideH w:val="single" w:sz="4" w:space="0" w:color="E2E8F0"/>
+          <w:top w:val="single" w:sz="6" w:space="0" w:color="CBD5E1"/>
+          <w:bottom w:val="single" w:sz="6" w:space="0" w:color="CBD5E1"/>
+          <w:insideH w:val="single" w:sz="6" w:space="0" w:color="CBD5E1"/>
           <w:left w:val="none"/>
           <w:right w:val="none"/>
           <w:insideV w:val="none"/>
         </w:tblBorders>
       </w:tblPr>
       <w:tblGrid>
-        <w:gridCol w:w="5263"/>
-        <w:gridCol w:w="5263"/>
+        <w:gridCol w:w="5292"/>
+        <w:gridCol w:w="5292"/>
       </w:tblGrid>
       <w:tr>
         <w:tc>
           <w:tcPr>
             <w:tcW w:type="dxa" w:w="6480"/>
             <w:tcMar>
-              <w:top w:w="15" w:type="dxa"/>
-              <w:bottom w:w="15" w:type="dxa"/>
-              <w:left w:w="30" w:type="dxa"/>
-              <w:right w:w="30" w:type="dxa"/>
+              <w:top w:w="10" w:type="dxa"/>
+              <w:bottom w:w="10" w:type="dxa"/>
+              <w:left w:w="20" w:type="dxa"/>
+              <w:right w:w="20" w:type="dxa"/>
             </w:tcMar>
           </w:tcPr>
           <w:p>
             <w:pPr>
-              <w:spacing w:before="0" w:after="0"/>
+              <w:spacing w:before="0" w:after="0" w:line="240" w:lineRule="auto"/>
             </w:pPr>
             <w:r>
               <w:rPr>
@@ -81,17 +81,17 @@
         </w:tc>
         <w:tc>
           <w:tcPr>
-            <w:tcW w:type="dxa" w:w="4032"/>
+            <w:tcW w:type="dxa" w:w="4104"/>
             <w:tcMar>
-              <w:top w:w="15" w:type="dxa"/>
-              <w:bottom w:w="15" w:type="dxa"/>
-              <w:left w:w="30" w:type="dxa"/>
-              <w:right w:w="30" w:type="dxa"/>
+              <w:top w:w="10" w:type="dxa"/>
+              <w:bottom w:w="10" w:type="dxa"/>
+              <w:left w:w="20" w:type="dxa"/>
+              <w:right w:w="20" w:type="dxa"/>
             </w:tcMar>
           </w:tcPr>
           <w:p>
             <w:pPr>
-              <w:spacing w:before="0" w:after="0"/>
+              <w:spacing w:before="0" w:after="0" w:line="240" w:lineRule="auto"/>
             </w:pPr>
             <w:r>
               <w:rPr>
@@ -118,15 +118,15 @@
           <w:tcPr>
             <w:tcW w:type="dxa" w:w="6480"/>
             <w:tcMar>
-              <w:top w:w="15" w:type="dxa"/>
-              <w:bottom w:w="15" w:type="dxa"/>
-              <w:left w:w="30" w:type="dxa"/>
-              <w:right w:w="30" w:type="dxa"/>
+              <w:top w:w="10" w:type="dxa"/>
+              <w:bottom w:w="10" w:type="dxa"/>
+              <w:left w:w="20" w:type="dxa"/>
+              <w:right w:w="20" w:type="dxa"/>
             </w:tcMar>
           </w:tcPr>
           <w:p>
             <w:pPr>
-              <w:spacing w:before="0" w:after="0"/>
+              <w:spacing w:before="0" w:after="0" w:line="240" w:lineRule="auto"/>
             </w:pPr>
             <w:r>
               <w:rPr>
@@ -143,23 +143,23 @@
                 <w:color w:val="0F172A"/>
                 <w:sz w:val="15"/>
               </w:rPr>
-              <w:t>Candidate (AI Forward Deployed Associate)</w:t>
+              <w:t>Bharanee B (AI Forward Deployed Associate Candidate)</w:t>
             </w:r>
           </w:p>
         </w:tc>
         <w:tc>
           <w:tcPr>
-            <w:tcW w:type="dxa" w:w="4032"/>
+            <w:tcW w:type="dxa" w:w="4104"/>
             <w:tcMar>
-              <w:top w:w="15" w:type="dxa"/>
-              <w:bottom w:w="15" w:type="dxa"/>
-              <w:left w:w="30" w:type="dxa"/>
-              <w:right w:w="30" w:type="dxa"/>
+              <w:top w:w="10" w:type="dxa"/>
+              <w:bottom w:w="10" w:type="dxa"/>
+              <w:left w:w="20" w:type="dxa"/>
+              <w:right w:w="20" w:type="dxa"/>
             </w:tcMar>
           </w:tcPr>
           <w:p>
             <w:pPr>
-              <w:spacing w:before="0" w:after="0"/>
+              <w:spacing w:before="0" w:after="0" w:line="240" w:lineRule="auto"/>
             </w:pPr>
             <w:r>
               <w:rPr>
@@ -168,16 +168,16 @@
                 <w:color w:val="64748B"/>
                 <w:sz w:val="15"/>
               </w:rPr>
-              <w:t xml:space="preserve">TARGET: </w:t>
+              <w:t xml:space="preserve">SUBJECT: </w:t>
             </w:r>
             <w:r>
               <w:rPr>
                 <w:rFonts w:ascii="Calibri" w:hAnsi="Calibri"/>
                 <w:b/>
-                <w:color w:val="0F172A"/>
+                <w:color w:val="1E1B4B"/>
                 <w:sz w:val="15"/>
               </w:rPr>
-              <w:t>Pre-Demo Attendance Rate (+₹24.12L/mo)</w:t>
+              <w:t>14-Day Plan to Recover ₹24.12L/mo in Trial Attendance</w:t>
             </w:r>
           </w:p>
         </w:tc>
@@ -204,21 +204,21 @@
         </w:tblBorders>
       </w:tblPr>
       <w:tblGrid>
-        <w:gridCol w:w="2632"/>
-        <w:gridCol w:w="2632"/>
-        <w:gridCol w:w="2632"/>
-        <w:gridCol w:w="2632"/>
+        <w:gridCol w:w="2646"/>
+        <w:gridCol w:w="2646"/>
+        <w:gridCol w:w="2646"/>
+        <w:gridCol w:w="2646"/>
       </w:tblGrid>
       <w:tr>
         <w:tc>
           <w:tcPr>
-            <w:tcW w:type="dxa" w:w="2621"/>
+            <w:tcW w:type="dxa" w:w="2635"/>
             <w:shd w:fill="FEF2F2"/>
             <w:tcMar>
-              <w:top w:w="40" w:type="dxa"/>
-              <w:bottom w:w="40" w:type="dxa"/>
-              <w:left w:w="40" w:type="dxa"/>
-              <w:right w:w="40" w:type="dxa"/>
+              <w:top w:w="35" w:type="dxa"/>
+              <w:bottom w:w="35" w:type="dxa"/>
+              <w:left w:w="30" w:type="dxa"/>
+              <w:right w:w="30" w:type="dxa"/>
             </w:tcMar>
           </w:tcPr>
           <w:p>
@@ -240,7 +240,7 @@
                 <w:rFonts w:ascii="Calibri" w:hAnsi="Calibri"/>
                 <w:b/>
                 <w:color w:val="B91C1C"/>
-                <w:sz w:val="20"/>
+                <w:sz w:val="19"/>
               </w:rPr>
               <w:t>₹61.62 Lakhs/mo</w:t>
               <w:br/>
@@ -257,13 +257,13 @@
         </w:tc>
         <w:tc>
           <w:tcPr>
-            <w:tcW w:type="dxa" w:w="2621"/>
+            <w:tcW w:type="dxa" w:w="2635"/>
             <w:shd w:fill="F0FDF4"/>
             <w:tcMar>
-              <w:top w:w="40" w:type="dxa"/>
-              <w:bottom w:w="40" w:type="dxa"/>
-              <w:left w:w="40" w:type="dxa"/>
-              <w:right w:w="40" w:type="dxa"/>
+              <w:top w:w="35" w:type="dxa"/>
+              <w:bottom w:w="35" w:type="dxa"/>
+              <w:left w:w="30" w:type="dxa"/>
+              <w:right w:w="30" w:type="dxa"/>
             </w:tcMar>
           </w:tcPr>
           <w:p>
@@ -285,7 +285,7 @@
                 <w:rFonts w:ascii="Calibri" w:hAnsi="Calibri"/>
                 <w:b/>
                 <w:color w:val="166534"/>
-                <w:sz w:val="20"/>
+                <w:sz w:val="19"/>
               </w:rPr>
               <w:t>+₹24.12 Lakhs/mo</w:t>
               <w:br/>
@@ -302,13 +302,13 @@
         </w:tc>
         <w:tc>
           <w:tcPr>
-            <w:tcW w:type="dxa" w:w="2621"/>
+            <w:tcW w:type="dxa" w:w="2635"/>
             <w:shd w:fill="F8FAFC"/>
             <w:tcMar>
-              <w:top w:w="40" w:type="dxa"/>
-              <w:bottom w:w="40" w:type="dxa"/>
-              <w:left w:w="40" w:type="dxa"/>
-              <w:right w:w="40" w:type="dxa"/>
+              <w:top w:w="35" w:type="dxa"/>
+              <w:bottom w:w="35" w:type="dxa"/>
+              <w:left w:w="30" w:type="dxa"/>
+              <w:right w:w="30" w:type="dxa"/>
             </w:tcMar>
           </w:tcPr>
           <w:p>
@@ -330,7 +330,7 @@
                 <w:rFonts w:ascii="Calibri" w:hAnsi="Calibri"/>
                 <w:b/>
                 <w:color w:val="1E1B4B"/>
-                <w:sz w:val="20"/>
+                <w:sz w:val="19"/>
               </w:rPr>
               <w:t>63.80% Show Rate</w:t>
               <w:br/>
@@ -347,13 +347,13 @@
         </w:tc>
         <w:tc>
           <w:tcPr>
-            <w:tcW w:type="dxa" w:w="2621"/>
+            <w:tcW w:type="dxa" w:w="2635"/>
             <w:shd w:fill="EEF2FF"/>
             <w:tcMar>
-              <w:top w:w="40" w:type="dxa"/>
-              <w:bottom w:w="40" w:type="dxa"/>
-              <w:left w:w="40" w:type="dxa"/>
-              <w:right w:w="40" w:type="dxa"/>
+              <w:top w:w="35" w:type="dxa"/>
+              <w:bottom w:w="35" w:type="dxa"/>
+              <w:left w:w="30" w:type="dxa"/>
+              <w:right w:w="30" w:type="dxa"/>
             </w:tcMar>
           </w:tcPr>
           <w:p>
@@ -375,7 +375,7 @@
                 <w:rFonts w:ascii="Calibri" w:hAnsi="Calibri"/>
                 <w:b/>
                 <w:color w:val="4F46E5"/>
-                <w:sz w:val="20"/>
+                <w:sz w:val="19"/>
               </w:rPr>
               <w:t>78.00% Show Rate</w:t>
               <w:br/>
@@ -386,7 +386,7 @@
                 <w:color w:val="334155"/>
                 <w:sz w:val="13"/>
               </w:rPr>
-              <w:t>Internal 24–48h benchmark cohort</w:t>
+              <w:t>Internal 24–48h cohort benchmark</w:t>
             </w:r>
           </w:p>
         </w:tc>
@@ -394,7 +394,7 @@
     </w:tbl>
     <w:p>
       <w:pPr>
-        <w:spacing w:before="80" w:after="30"/>
+        <w:spacing w:before="70" w:after="30" w:line="240" w:lineRule="auto"/>
       </w:pPr>
       <w:r>
         <w:rPr>
@@ -416,7 +416,7 @@
           <w:color w:val="0F172A"/>
           <w:sz w:val="15"/>
         </w:rPr>
-        <w:t xml:space="preserve">Across 5,000 anonymised leads covering two operating months (June–July 2026; 2,500/mo) at ₹60,000 revenue per student and ₹900 CAC, the funnel's single largest revenue drain is </w:t>
+        <w:t xml:space="preserve">Across 5,000 anonymised leads covering June–July 2026 (2,500/mo) at ₹60,000 revenue/converted student and ₹900 CAC, the single largest financial drain is </w:t>
       </w:r>
       <w:r>
         <w:rPr>
@@ -452,22 +452,22 @@
         </w:tblBorders>
       </w:tblPr>
       <w:tblGrid>
-        <w:gridCol w:w="2105"/>
-        <w:gridCol w:w="2105"/>
-        <w:gridCol w:w="2105"/>
-        <w:gridCol w:w="2105"/>
-        <w:gridCol w:w="2105"/>
+        <w:gridCol w:w="2117"/>
+        <w:gridCol w:w="2117"/>
+        <w:gridCol w:w="2117"/>
+        <w:gridCol w:w="2117"/>
+        <w:gridCol w:w="2117"/>
       </w:tblGrid>
       <w:tr>
         <w:tc>
           <w:tcPr>
-            <w:tcW w:type="dxa" w:w="2592"/>
+            <w:tcW w:type="dxa" w:w="2520"/>
             <w:shd w:fill="F1F5F9"/>
             <w:tcMar>
-              <w:top w:w="20" w:type="dxa"/>
-              <w:bottom w:w="20" w:type="dxa"/>
-              <w:left w:w="30" w:type="dxa"/>
-              <w:right w:w="30" w:type="dxa"/>
+              <w:top w:w="15" w:type="dxa"/>
+              <w:bottom w:w="15" w:type="dxa"/>
+              <w:left w:w="25" w:type="dxa"/>
+              <w:right w:w="25" w:type="dxa"/>
             </w:tcMar>
           </w:tcPr>
           <w:p>
@@ -487,13 +487,13 @@
         </w:tc>
         <w:tc>
           <w:tcPr>
-            <w:tcW w:type="dxa" w:w="1152"/>
+            <w:tcW w:type="dxa" w:w="1224"/>
             <w:shd w:fill="F1F5F9"/>
             <w:tcMar>
-              <w:top w:w="20" w:type="dxa"/>
-              <w:bottom w:w="20" w:type="dxa"/>
-              <w:left w:w="30" w:type="dxa"/>
-              <w:right w:w="30" w:type="dxa"/>
+              <w:top w:w="15" w:type="dxa"/>
+              <w:bottom w:w="15" w:type="dxa"/>
+              <w:left w:w="25" w:type="dxa"/>
+              <w:right w:w="25" w:type="dxa"/>
             </w:tcMar>
           </w:tcPr>
           <w:p>
@@ -516,10 +516,10 @@
             <w:tcW w:type="dxa" w:w="1224"/>
             <w:shd w:fill="F1F5F9"/>
             <w:tcMar>
-              <w:top w:w="20" w:type="dxa"/>
-              <w:bottom w:w="20" w:type="dxa"/>
-              <w:left w:w="30" w:type="dxa"/>
-              <w:right w:w="30" w:type="dxa"/>
+              <w:top w:w="15" w:type="dxa"/>
+              <w:bottom w:w="15" w:type="dxa"/>
+              <w:left w:w="25" w:type="dxa"/>
+              <w:right w:w="25" w:type="dxa"/>
             </w:tcMar>
           </w:tcPr>
           <w:p>
@@ -539,13 +539,13 @@
         </w:tc>
         <w:tc>
           <w:tcPr>
-            <w:tcW w:type="dxa" w:w="1008"/>
+            <w:tcW w:type="dxa" w:w="1080"/>
             <w:shd w:fill="F1F5F9"/>
             <w:tcMar>
-              <w:top w:w="20" w:type="dxa"/>
-              <w:bottom w:w="20" w:type="dxa"/>
-              <w:left w:w="30" w:type="dxa"/>
-              <w:right w:w="30" w:type="dxa"/>
+              <w:top w:w="15" w:type="dxa"/>
+              <w:bottom w:w="15" w:type="dxa"/>
+              <w:left w:w="25" w:type="dxa"/>
+              <w:right w:w="25" w:type="dxa"/>
             </w:tcMar>
           </w:tcPr>
           <w:p>
@@ -568,10 +568,10 @@
             <w:tcW w:type="dxa" w:w="4536"/>
             <w:shd w:fill="F1F5F9"/>
             <w:tcMar>
-              <w:top w:w="20" w:type="dxa"/>
-              <w:bottom w:w="20" w:type="dxa"/>
-              <w:left w:w="30" w:type="dxa"/>
-              <w:right w:w="30" w:type="dxa"/>
+              <w:top w:w="15" w:type="dxa"/>
+              <w:bottom w:w="15" w:type="dxa"/>
+              <w:left w:w="25" w:type="dxa"/>
+              <w:right w:w="25" w:type="dxa"/>
             </w:tcMar>
           </w:tcPr>
           <w:p>
@@ -593,12 +593,12 @@
       <w:tr>
         <w:tc>
           <w:tcPr>
-            <w:tcW w:type="dxa" w:w="2592"/>
+            <w:tcW w:type="dxa" w:w="2520"/>
             <w:tcMar>
-              <w:top w:w="15" w:type="dxa"/>
-              <w:bottom w:w="15" w:type="dxa"/>
-              <w:left w:w="30" w:type="dxa"/>
-              <w:right w:w="30" w:type="dxa"/>
+              <w:top w:w="12" w:type="dxa"/>
+              <w:bottom w:w="12" w:type="dxa"/>
+              <w:left w:w="25" w:type="dxa"/>
+              <w:right w:w="25" w:type="dxa"/>
             </w:tcMar>
           </w:tcPr>
           <w:p>
@@ -617,12 +617,12 @@
         </w:tc>
         <w:tc>
           <w:tcPr>
-            <w:tcW w:type="dxa" w:w="1152"/>
+            <w:tcW w:type="dxa" w:w="1224"/>
             <w:tcMar>
-              <w:top w:w="15" w:type="dxa"/>
-              <w:bottom w:w="15" w:type="dxa"/>
-              <w:left w:w="30" w:type="dxa"/>
-              <w:right w:w="30" w:type="dxa"/>
+              <w:top w:w="12" w:type="dxa"/>
+              <w:bottom w:w="12" w:type="dxa"/>
+              <w:left w:w="25" w:type="dxa"/>
+              <w:right w:w="25" w:type="dxa"/>
             </w:tcMar>
           </w:tcPr>
           <w:p>
@@ -643,10 +643,10 @@
           <w:tcPr>
             <w:tcW w:type="dxa" w:w="1224"/>
             <w:tcMar>
-              <w:top w:w="15" w:type="dxa"/>
-              <w:bottom w:w="15" w:type="dxa"/>
-              <w:left w:w="30" w:type="dxa"/>
-              <w:right w:w="30" w:type="dxa"/>
+              <w:top w:w="12" w:type="dxa"/>
+              <w:bottom w:w="12" w:type="dxa"/>
+              <w:left w:w="25" w:type="dxa"/>
+              <w:right w:w="25" w:type="dxa"/>
             </w:tcMar>
           </w:tcPr>
           <w:p>
@@ -665,12 +665,12 @@
         </w:tc>
         <w:tc>
           <w:tcPr>
-            <w:tcW w:type="dxa" w:w="1008"/>
+            <w:tcW w:type="dxa" w:w="1080"/>
             <w:tcMar>
-              <w:top w:w="15" w:type="dxa"/>
-              <w:bottom w:w="15" w:type="dxa"/>
-              <w:left w:w="30" w:type="dxa"/>
-              <w:right w:w="30" w:type="dxa"/>
+              <w:top w:w="12" w:type="dxa"/>
+              <w:bottom w:w="12" w:type="dxa"/>
+              <w:left w:w="25" w:type="dxa"/>
+              <w:right w:w="25" w:type="dxa"/>
             </w:tcMar>
           </w:tcPr>
           <w:p>
@@ -691,10 +691,10 @@
           <w:tcPr>
             <w:tcW w:type="dxa" w:w="4536"/>
             <w:tcMar>
-              <w:top w:w="15" w:type="dxa"/>
-              <w:bottom w:w="15" w:type="dxa"/>
-              <w:left w:w="30" w:type="dxa"/>
-              <w:right w:w="30" w:type="dxa"/>
+              <w:top w:w="12" w:type="dxa"/>
+              <w:bottom w:w="12" w:type="dxa"/>
+              <w:left w:w="25" w:type="dxa"/>
+              <w:right w:w="25" w:type="dxa"/>
             </w:tcMar>
           </w:tcPr>
           <w:p>
@@ -715,13 +715,13 @@
       <w:tr>
         <w:tc>
           <w:tcPr>
-            <w:tcW w:type="dxa" w:w="2592"/>
+            <w:tcW w:type="dxa" w:w="2520"/>
             <w:shd w:fill="FEF2F2"/>
             <w:tcMar>
-              <w:top w:w="15" w:type="dxa"/>
-              <w:bottom w:w="15" w:type="dxa"/>
-              <w:left w:w="30" w:type="dxa"/>
-              <w:right w:w="30" w:type="dxa"/>
+              <w:top w:w="12" w:type="dxa"/>
+              <w:bottom w:w="12" w:type="dxa"/>
+              <w:left w:w="25" w:type="dxa"/>
+              <w:right w:w="25" w:type="dxa"/>
             </w:tcMar>
           </w:tcPr>
           <w:p>
@@ -741,13 +741,13 @@
         </w:tc>
         <w:tc>
           <w:tcPr>
-            <w:tcW w:type="dxa" w:w="1152"/>
+            <w:tcW w:type="dxa" w:w="1224"/>
             <w:shd w:fill="FEF2F2"/>
             <w:tcMar>
-              <w:top w:w="15" w:type="dxa"/>
-              <w:bottom w:w="15" w:type="dxa"/>
-              <w:left w:w="30" w:type="dxa"/>
-              <w:right w:w="30" w:type="dxa"/>
+              <w:top w:w="12" w:type="dxa"/>
+              <w:bottom w:w="12" w:type="dxa"/>
+              <w:left w:w="25" w:type="dxa"/>
+              <w:right w:w="25" w:type="dxa"/>
             </w:tcMar>
           </w:tcPr>
           <w:p>
@@ -770,10 +770,10 @@
             <w:tcW w:type="dxa" w:w="1224"/>
             <w:shd w:fill="FEF2F2"/>
             <w:tcMar>
-              <w:top w:w="15" w:type="dxa"/>
-              <w:bottom w:w="15" w:type="dxa"/>
-              <w:left w:w="30" w:type="dxa"/>
-              <w:right w:w="30" w:type="dxa"/>
+              <w:top w:w="12" w:type="dxa"/>
+              <w:bottom w:w="12" w:type="dxa"/>
+              <w:left w:w="25" w:type="dxa"/>
+              <w:right w:w="25" w:type="dxa"/>
             </w:tcMar>
           </w:tcPr>
           <w:p>
@@ -793,13 +793,13 @@
         </w:tc>
         <w:tc>
           <w:tcPr>
-            <w:tcW w:type="dxa" w:w="1008"/>
+            <w:tcW w:type="dxa" w:w="1080"/>
             <w:shd w:fill="FEF2F2"/>
             <w:tcMar>
-              <w:top w:w="15" w:type="dxa"/>
-              <w:bottom w:w="15" w:type="dxa"/>
-              <w:left w:w="30" w:type="dxa"/>
-              <w:right w:w="30" w:type="dxa"/>
+              <w:top w:w="12" w:type="dxa"/>
+              <w:bottom w:w="12" w:type="dxa"/>
+              <w:left w:w="25" w:type="dxa"/>
+              <w:right w:w="25" w:type="dxa"/>
             </w:tcMar>
           </w:tcPr>
           <w:p>
@@ -822,10 +822,10 @@
             <w:tcW w:type="dxa" w:w="4536"/>
             <w:shd w:fill="FEF2F2"/>
             <w:tcMar>
-              <w:top w:w="15" w:type="dxa"/>
-              <w:bottom w:w="15" w:type="dxa"/>
-              <w:left w:w="30" w:type="dxa"/>
-              <w:right w:w="30" w:type="dxa"/>
+              <w:top w:w="12" w:type="dxa"/>
+              <w:bottom w:w="12" w:type="dxa"/>
+              <w:left w:w="25" w:type="dxa"/>
+              <w:right w:w="25" w:type="dxa"/>
             </w:tcMar>
           </w:tcPr>
           <w:p>
@@ -847,12 +847,12 @@
       <w:tr>
         <w:tc>
           <w:tcPr>
-            <w:tcW w:type="dxa" w:w="2592"/>
+            <w:tcW w:type="dxa" w:w="2520"/>
             <w:tcMar>
-              <w:top w:w="15" w:type="dxa"/>
-              <w:bottom w:w="15" w:type="dxa"/>
-              <w:left w:w="30" w:type="dxa"/>
-              <w:right w:w="30" w:type="dxa"/>
+              <w:top w:w="12" w:type="dxa"/>
+              <w:bottom w:w="12" w:type="dxa"/>
+              <w:left w:w="25" w:type="dxa"/>
+              <w:right w:w="25" w:type="dxa"/>
             </w:tcMar>
           </w:tcPr>
           <w:p>
@@ -871,12 +871,12 @@
         </w:tc>
         <w:tc>
           <w:tcPr>
-            <w:tcW w:type="dxa" w:w="1152"/>
+            <w:tcW w:type="dxa" w:w="1224"/>
             <w:tcMar>
-              <w:top w:w="15" w:type="dxa"/>
-              <w:bottom w:w="15" w:type="dxa"/>
-              <w:left w:w="30" w:type="dxa"/>
-              <w:right w:w="30" w:type="dxa"/>
+              <w:top w:w="12" w:type="dxa"/>
+              <w:bottom w:w="12" w:type="dxa"/>
+              <w:left w:w="25" w:type="dxa"/>
+              <w:right w:w="25" w:type="dxa"/>
             </w:tcMar>
           </w:tcPr>
           <w:p>
@@ -897,10 +897,10 @@
           <w:tcPr>
             <w:tcW w:type="dxa" w:w="1224"/>
             <w:tcMar>
-              <w:top w:w="15" w:type="dxa"/>
-              <w:bottom w:w="15" w:type="dxa"/>
-              <w:left w:w="30" w:type="dxa"/>
-              <w:right w:w="30" w:type="dxa"/>
+              <w:top w:w="12" w:type="dxa"/>
+              <w:bottom w:w="12" w:type="dxa"/>
+              <w:left w:w="25" w:type="dxa"/>
+              <w:right w:w="25" w:type="dxa"/>
             </w:tcMar>
           </w:tcPr>
           <w:p>
@@ -919,12 +919,12 @@
         </w:tc>
         <w:tc>
           <w:tcPr>
-            <w:tcW w:type="dxa" w:w="1008"/>
+            <w:tcW w:type="dxa" w:w="1080"/>
             <w:tcMar>
-              <w:top w:w="15" w:type="dxa"/>
-              <w:bottom w:w="15" w:type="dxa"/>
-              <w:left w:w="30" w:type="dxa"/>
-              <w:right w:w="30" w:type="dxa"/>
+              <w:top w:w="12" w:type="dxa"/>
+              <w:bottom w:w="12" w:type="dxa"/>
+              <w:left w:w="25" w:type="dxa"/>
+              <w:right w:w="25" w:type="dxa"/>
             </w:tcMar>
           </w:tcPr>
           <w:p>
@@ -945,10 +945,10 @@
           <w:tcPr>
             <w:tcW w:type="dxa" w:w="4536"/>
             <w:tcMar>
-              <w:top w:w="15" w:type="dxa"/>
-              <w:bottom w:w="15" w:type="dxa"/>
-              <w:left w:w="30" w:type="dxa"/>
-              <w:right w:w="30" w:type="dxa"/>
+              <w:top w:w="12" w:type="dxa"/>
+              <w:bottom w:w="12" w:type="dxa"/>
+              <w:left w:w="25" w:type="dxa"/>
+              <w:right w:w="25" w:type="dxa"/>
             </w:tcMar>
           </w:tcPr>
           <w:p>
@@ -969,12 +969,12 @@
       <w:tr>
         <w:tc>
           <w:tcPr>
-            <w:tcW w:type="dxa" w:w="2592"/>
+            <w:tcW w:type="dxa" w:w="2520"/>
             <w:tcMar>
-              <w:top w:w="15" w:type="dxa"/>
-              <w:bottom w:w="15" w:type="dxa"/>
-              <w:left w:w="30" w:type="dxa"/>
-              <w:right w:w="30" w:type="dxa"/>
+              <w:top w:w="12" w:type="dxa"/>
+              <w:bottom w:w="12" w:type="dxa"/>
+              <w:left w:w="25" w:type="dxa"/>
+              <w:right w:w="25" w:type="dxa"/>
             </w:tcMar>
           </w:tcPr>
           <w:p>
@@ -993,12 +993,12 @@
         </w:tc>
         <w:tc>
           <w:tcPr>
-            <w:tcW w:type="dxa" w:w="1152"/>
+            <w:tcW w:type="dxa" w:w="1224"/>
             <w:tcMar>
-              <w:top w:w="15" w:type="dxa"/>
-              <w:bottom w:w="15" w:type="dxa"/>
-              <w:left w:w="30" w:type="dxa"/>
-              <w:right w:w="30" w:type="dxa"/>
+              <w:top w:w="12" w:type="dxa"/>
+              <w:bottom w:w="12" w:type="dxa"/>
+              <w:left w:w="25" w:type="dxa"/>
+              <w:right w:w="25" w:type="dxa"/>
             </w:tcMar>
           </w:tcPr>
           <w:p>
@@ -1019,10 +1019,10 @@
           <w:tcPr>
             <w:tcW w:type="dxa" w:w="1224"/>
             <w:tcMar>
-              <w:top w:w="15" w:type="dxa"/>
-              <w:bottom w:w="15" w:type="dxa"/>
-              <w:left w:w="30" w:type="dxa"/>
-              <w:right w:w="30" w:type="dxa"/>
+              <w:top w:w="12" w:type="dxa"/>
+              <w:bottom w:w="12" w:type="dxa"/>
+              <w:left w:w="25" w:type="dxa"/>
+              <w:right w:w="25" w:type="dxa"/>
             </w:tcMar>
           </w:tcPr>
           <w:p>
@@ -1041,12 +1041,12 @@
         </w:tc>
         <w:tc>
           <w:tcPr>
-            <w:tcW w:type="dxa" w:w="1008"/>
+            <w:tcW w:type="dxa" w:w="1080"/>
             <w:tcMar>
-              <w:top w:w="15" w:type="dxa"/>
-              <w:bottom w:w="15" w:type="dxa"/>
-              <w:left w:w="30" w:type="dxa"/>
-              <w:right w:w="30" w:type="dxa"/>
+              <w:top w:w="12" w:type="dxa"/>
+              <w:bottom w:w="12" w:type="dxa"/>
+              <w:left w:w="25" w:type="dxa"/>
+              <w:right w:w="25" w:type="dxa"/>
             </w:tcMar>
           </w:tcPr>
           <w:p>
@@ -1067,10 +1067,10 @@
           <w:tcPr>
             <w:tcW w:type="dxa" w:w="4536"/>
             <w:tcMar>
-              <w:top w:w="15" w:type="dxa"/>
-              <w:bottom w:w="15" w:type="dxa"/>
-              <w:left w:w="30" w:type="dxa"/>
-              <w:right w:w="30" w:type="dxa"/>
+              <w:top w:w="12" w:type="dxa"/>
+              <w:bottom w:w="12" w:type="dxa"/>
+              <w:left w:w="25" w:type="dxa"/>
+              <w:right w:w="25" w:type="dxa"/>
             </w:tcMar>
           </w:tcPr>
           <w:p>
@@ -1091,7 +1091,7 @@
     </w:tbl>
     <w:p>
       <w:pPr>
-        <w:spacing w:before="80" w:after="30"/>
+        <w:spacing w:before="70" w:after="30" w:line="240" w:lineRule="auto"/>
       </w:pPr>
       <w:r>
         <w:rPr>
@@ -1145,7 +1145,7 @@
     </w:p>
     <w:p>
       <w:pPr>
-        <w:spacing w:before="80" w:after="30"/>
+        <w:spacing w:before="70" w:after="30" w:line="240" w:lineRule="auto"/>
       </w:pPr>
       <w:r>
         <w:rPr>
@@ -1176,7 +1176,7 @@
           <w:color w:val="0F172A"/>
           <w:sz w:val="15"/>
         </w:rPr>
-        <w:t>Sales reps may distrust bot confirmations and double-call parents (causing annoyance), while parents may block spammy alerts.</w:t>
+        <w:t>Sales reps may distrust bot confirmations and double-call parents (causing annoyance), while parents may block spammy automated alerts.</w:t>
         <w:br/>
       </w:r>
       <w:r>
@@ -1199,7 +1199,7 @@
     </w:p>
     <w:p>
       <w:pPr>
-        <w:spacing w:before="80" w:after="30"/>
+        <w:spacing w:before="70" w:after="30" w:line="240" w:lineRule="auto"/>
       </w:pPr>
       <w:r>
         <w:rPr>
@@ -1271,7 +1271,7 @@
     </w:p>
     <w:sectPr>
       <w:pgSz w:w="11909" w:h="16834"/>
-      <w:pgMar w:top="504" w:right="691" w:bottom="461" w:left="691" w:header="720" w:footer="720" w:gutter="0"/>
+      <w:pgMar w:top="461" w:right="662" w:bottom="432" w:left="662" w:header="720" w:footer="720" w:gutter="0"/>
       <w:cols w:space="720"/>
       <w:docGrid w:linePitch="360"/>
     </w:sectPr>

</xml_diff>